<commit_message>
terminei endpoint signup, login logout(todos funcionais)
</commit_message>
<xml_diff>
--- a/projeto-portal2-05.docx
+++ b/projeto-portal2-05.docx
@@ -2676,10 +2676,2543 @@
     <w:p/>
     <w:p>
       <w:r>
-        <w:t>Criei o sistema de autenticação usando JWT e estava começando a implementar na parte de auth.controller</w:t>
+        <w:t xml:space="preserve">Criei uma pasta chamada </w:t>
+      </w:r>
+      <w:proofErr w:type="spellStart"/>
+      <w:r>
+        <w:t>utilis</w:t>
+      </w:r>
+      <w:proofErr w:type="spellEnd"/>
+      <w:r>
+        <w:t xml:space="preserve"> e dentro dela tem o gerador de JWT.</w:t>
+      </w:r>
+      <w:r>
+        <w:t xml:space="preserve"> Além de gerar o JWT, ele gera um cookie que dura 15 dias, eu ainda não entendi para que serve.</w:t>
+      </w:r>
+    </w:p>
+    <w:p>
+      <w:r>
+        <w:t>Para implementar essas funcionalidades, é preciso adicionar elas na rota de login. Para começar adicionei no arquivo auth.controller.js, dentro do logout (tanto o JWT quanto o cookie).</w:t>
+      </w:r>
+    </w:p>
+    <w:p>
+      <w:r>
+        <w:lastRenderedPageBreak/>
+        <w:t>Dia 5</w:t>
+      </w:r>
+    </w:p>
+    <w:p>
+      <w:r>
+        <w:t xml:space="preserve">Vou deixar aqui a função de procurar a conta pelo </w:t>
+      </w:r>
+      <w:proofErr w:type="spellStart"/>
+      <w:r>
+        <w:t>email</w:t>
+      </w:r>
+      <w:proofErr w:type="spellEnd"/>
+      <w:r>
+        <w:t xml:space="preserve">, porque estava na rota de </w:t>
+      </w:r>
+      <w:proofErr w:type="gramStart"/>
+      <w:r>
+        <w:t>login</w:t>
+      </w:r>
+      <w:proofErr w:type="gramEnd"/>
+      <w:r>
+        <w:t xml:space="preserve"> mas eu nem criei ela ainda direito.</w:t>
+      </w:r>
+    </w:p>
+    <w:p>
+      <w:pPr>
+        <w:shd w:val="clear" w:color="auto" w:fill="1E1E1E"/>
+        <w:spacing w:line="285" w:lineRule="atLeast"/>
+        <w:rPr>
+          <w:rFonts w:ascii="Consolas" w:eastAsia="Times New Roman" w:hAnsi="Consolas" w:cs="Times New Roman"/>
+          <w:color w:val="D4D4D4"/>
+          <w:kern w:val="0"/>
+          <w:sz w:val="21"/>
+          <w:szCs w:val="21"/>
+          <w:lang w:eastAsia="pt-BR"/>
+          <w14:ligatures w14:val="none"/>
+        </w:rPr>
+      </w:pPr>
+      <w:r>
+        <w:br/>
+      </w:r>
+      <w:r>
+        <w:rPr>
+          <w:rFonts w:ascii="Consolas" w:eastAsia="Times New Roman" w:hAnsi="Consolas" w:cs="Times New Roman"/>
+          <w:color w:val="D4D4D4"/>
+          <w:kern w:val="0"/>
+          <w:sz w:val="21"/>
+          <w:szCs w:val="21"/>
+          <w:lang w:eastAsia="pt-BR"/>
+          <w14:ligatures w14:val="none"/>
+        </w:rPr>
+        <w:t> </w:t>
+      </w:r>
+      <w:proofErr w:type="spellStart"/>
+      <w:r>
+        <w:rPr>
+          <w:rFonts w:ascii="Consolas" w:eastAsia="Times New Roman" w:hAnsi="Consolas" w:cs="Times New Roman"/>
+          <w:color w:val="C586C0"/>
+          <w:kern w:val="0"/>
+          <w:sz w:val="21"/>
+          <w:szCs w:val="21"/>
+          <w:lang w:eastAsia="pt-BR"/>
+          <w14:ligatures w14:val="none"/>
+        </w:rPr>
+        <w:t>try</w:t>
+      </w:r>
+      <w:proofErr w:type="spellEnd"/>
+      <w:r>
+        <w:rPr>
+          <w:rFonts w:ascii="Consolas" w:eastAsia="Times New Roman" w:hAnsi="Consolas" w:cs="Times New Roman"/>
+          <w:color w:val="D4D4D4"/>
+          <w:kern w:val="0"/>
+          <w:sz w:val="21"/>
+          <w:szCs w:val="21"/>
+          <w:lang w:eastAsia="pt-BR"/>
+          <w14:ligatures w14:val="none"/>
+        </w:rPr>
+        <w:t xml:space="preserve"> {</w:t>
+      </w:r>
+    </w:p>
+    <w:p>
+      <w:pPr>
+        <w:shd w:val="clear" w:color="auto" w:fill="1E1E1E"/>
+        <w:spacing w:after="0" w:line="285" w:lineRule="atLeast"/>
+        <w:rPr>
+          <w:rFonts w:ascii="Consolas" w:eastAsia="Times New Roman" w:hAnsi="Consolas" w:cs="Times New Roman"/>
+          <w:color w:val="D4D4D4"/>
+          <w:kern w:val="0"/>
+          <w:sz w:val="21"/>
+          <w:szCs w:val="21"/>
+          <w:lang w:eastAsia="pt-BR"/>
+          <w14:ligatures w14:val="none"/>
+        </w:rPr>
+      </w:pPr>
+      <w:r>
+        <w:rPr>
+          <w:rFonts w:ascii="Consolas" w:eastAsia="Times New Roman" w:hAnsi="Consolas" w:cs="Times New Roman"/>
+          <w:color w:val="D4D4D4"/>
+          <w:kern w:val="0"/>
+          <w:sz w:val="21"/>
+          <w:szCs w:val="21"/>
+          <w:lang w:eastAsia="pt-BR"/>
+          <w14:ligatures w14:val="none"/>
+        </w:rPr>
+        <w:t xml:space="preserve">        </w:t>
+      </w:r>
+      <w:proofErr w:type="spellStart"/>
+      <w:r>
+        <w:rPr>
+          <w:rFonts w:ascii="Consolas" w:eastAsia="Times New Roman" w:hAnsi="Consolas" w:cs="Times New Roman"/>
+          <w:color w:val="4FC1FF"/>
+          <w:kern w:val="0"/>
+          <w:sz w:val="21"/>
+          <w:szCs w:val="21"/>
+          <w:lang w:eastAsia="pt-BR"/>
+          <w14:ligatures w14:val="none"/>
+        </w:rPr>
+        <w:t>User</w:t>
+      </w:r>
+      <w:r>
+        <w:rPr>
+          <w:rFonts w:ascii="Consolas" w:eastAsia="Times New Roman" w:hAnsi="Consolas" w:cs="Times New Roman"/>
+          <w:color w:val="D4D4D4"/>
+          <w:kern w:val="0"/>
+          <w:sz w:val="21"/>
+          <w:szCs w:val="21"/>
+          <w:lang w:eastAsia="pt-BR"/>
+          <w14:ligatures w14:val="none"/>
+        </w:rPr>
+        <w:t>.</w:t>
+      </w:r>
+      <w:r>
+        <w:rPr>
+          <w:rFonts w:ascii="Consolas" w:eastAsia="Times New Roman" w:hAnsi="Consolas" w:cs="Times New Roman"/>
+          <w:color w:val="DCDCAA"/>
+          <w:kern w:val="0"/>
+          <w:sz w:val="21"/>
+          <w:szCs w:val="21"/>
+          <w:lang w:eastAsia="pt-BR"/>
+          <w14:ligatures w14:val="none"/>
+        </w:rPr>
+        <w:t>findByEmail</w:t>
+      </w:r>
+      <w:proofErr w:type="spellEnd"/>
+      <w:r>
+        <w:rPr>
+          <w:rFonts w:ascii="Consolas" w:eastAsia="Times New Roman" w:hAnsi="Consolas" w:cs="Times New Roman"/>
+          <w:color w:val="D4D4D4"/>
+          <w:kern w:val="0"/>
+          <w:sz w:val="21"/>
+          <w:szCs w:val="21"/>
+          <w:lang w:eastAsia="pt-BR"/>
+          <w14:ligatures w14:val="none"/>
+        </w:rPr>
+        <w:t>(</w:t>
+      </w:r>
+      <w:proofErr w:type="spellStart"/>
+      <w:r>
+        <w:rPr>
+          <w:rFonts w:ascii="Consolas" w:eastAsia="Times New Roman" w:hAnsi="Consolas" w:cs="Times New Roman"/>
+          <w:color w:val="4FC1FF"/>
+          <w:kern w:val="0"/>
+          <w:sz w:val="21"/>
+          <w:szCs w:val="21"/>
+          <w:lang w:eastAsia="pt-BR"/>
+          <w14:ligatures w14:val="none"/>
+        </w:rPr>
+        <w:t>email</w:t>
+      </w:r>
+      <w:proofErr w:type="spellEnd"/>
+      <w:r>
+        <w:rPr>
+          <w:rFonts w:ascii="Consolas" w:eastAsia="Times New Roman" w:hAnsi="Consolas" w:cs="Times New Roman"/>
+          <w:color w:val="D4D4D4"/>
+          <w:kern w:val="0"/>
+          <w:sz w:val="21"/>
+          <w:szCs w:val="21"/>
+          <w:lang w:eastAsia="pt-BR"/>
+          <w14:ligatures w14:val="none"/>
+        </w:rPr>
+        <w:t xml:space="preserve">, </w:t>
+      </w:r>
+      <w:proofErr w:type="spellStart"/>
+      <w:r>
+        <w:rPr>
+          <w:rFonts w:ascii="Consolas" w:eastAsia="Times New Roman" w:hAnsi="Consolas" w:cs="Times New Roman"/>
+          <w:color w:val="569CD6"/>
+          <w:kern w:val="0"/>
+          <w:sz w:val="21"/>
+          <w:szCs w:val="21"/>
+          <w:lang w:eastAsia="pt-BR"/>
+          <w14:ligatures w14:val="none"/>
+        </w:rPr>
+        <w:t>async</w:t>
+      </w:r>
+      <w:proofErr w:type="spellEnd"/>
+      <w:r>
+        <w:rPr>
+          <w:rFonts w:ascii="Consolas" w:eastAsia="Times New Roman" w:hAnsi="Consolas" w:cs="Times New Roman"/>
+          <w:color w:val="D4D4D4"/>
+          <w:kern w:val="0"/>
+          <w:sz w:val="21"/>
+          <w:szCs w:val="21"/>
+          <w:lang w:eastAsia="pt-BR"/>
+          <w14:ligatures w14:val="none"/>
+        </w:rPr>
+        <w:t xml:space="preserve"> (</w:t>
+      </w:r>
+      <w:proofErr w:type="spellStart"/>
+      <w:r>
+        <w:rPr>
+          <w:rFonts w:ascii="Consolas" w:eastAsia="Times New Roman" w:hAnsi="Consolas" w:cs="Times New Roman"/>
+          <w:color w:val="9CDCFE"/>
+          <w:kern w:val="0"/>
+          <w:sz w:val="21"/>
+          <w:szCs w:val="21"/>
+          <w:lang w:eastAsia="pt-BR"/>
+          <w14:ligatures w14:val="none"/>
+        </w:rPr>
+        <w:t>err</w:t>
+      </w:r>
+      <w:proofErr w:type="spellEnd"/>
+      <w:r>
+        <w:rPr>
+          <w:rFonts w:ascii="Consolas" w:eastAsia="Times New Roman" w:hAnsi="Consolas" w:cs="Times New Roman"/>
+          <w:color w:val="D4D4D4"/>
+          <w:kern w:val="0"/>
+          <w:sz w:val="21"/>
+          <w:szCs w:val="21"/>
+          <w:lang w:eastAsia="pt-BR"/>
+          <w14:ligatures w14:val="none"/>
+        </w:rPr>
+        <w:t xml:space="preserve">, </w:t>
+      </w:r>
+      <w:proofErr w:type="spellStart"/>
+      <w:r>
+        <w:rPr>
+          <w:rFonts w:ascii="Consolas" w:eastAsia="Times New Roman" w:hAnsi="Consolas" w:cs="Times New Roman"/>
+          <w:color w:val="9CDCFE"/>
+          <w:kern w:val="0"/>
+          <w:sz w:val="21"/>
+          <w:szCs w:val="21"/>
+          <w:lang w:eastAsia="pt-BR"/>
+          <w14:ligatures w14:val="none"/>
+        </w:rPr>
+        <w:t>user</w:t>
+      </w:r>
+      <w:proofErr w:type="spellEnd"/>
+      <w:r>
+        <w:rPr>
+          <w:rFonts w:ascii="Consolas" w:eastAsia="Times New Roman" w:hAnsi="Consolas" w:cs="Times New Roman"/>
+          <w:color w:val="D4D4D4"/>
+          <w:kern w:val="0"/>
+          <w:sz w:val="21"/>
+          <w:szCs w:val="21"/>
+          <w:lang w:eastAsia="pt-BR"/>
+          <w14:ligatures w14:val="none"/>
+        </w:rPr>
+        <w:t xml:space="preserve">) </w:t>
+      </w:r>
+      <w:r>
+        <w:rPr>
+          <w:rFonts w:ascii="Consolas" w:eastAsia="Times New Roman" w:hAnsi="Consolas" w:cs="Times New Roman"/>
+          <w:color w:val="569CD6"/>
+          <w:kern w:val="0"/>
+          <w:sz w:val="21"/>
+          <w:szCs w:val="21"/>
+          <w:lang w:eastAsia="pt-BR"/>
+          <w14:ligatures w14:val="none"/>
+        </w:rPr>
+        <w:t>=&gt;</w:t>
+      </w:r>
+      <w:r>
+        <w:rPr>
+          <w:rFonts w:ascii="Consolas" w:eastAsia="Times New Roman" w:hAnsi="Consolas" w:cs="Times New Roman"/>
+          <w:color w:val="D4D4D4"/>
+          <w:kern w:val="0"/>
+          <w:sz w:val="21"/>
+          <w:szCs w:val="21"/>
+          <w:lang w:eastAsia="pt-BR"/>
+          <w14:ligatures w14:val="none"/>
+        </w:rPr>
+        <w:t xml:space="preserve"> {</w:t>
+      </w:r>
+    </w:p>
+    <w:p>
+      <w:pPr>
+        <w:shd w:val="clear" w:color="auto" w:fill="1E1E1E"/>
+        <w:spacing w:after="0" w:line="285" w:lineRule="atLeast"/>
+        <w:rPr>
+          <w:rFonts w:ascii="Consolas" w:eastAsia="Times New Roman" w:hAnsi="Consolas" w:cs="Times New Roman"/>
+          <w:color w:val="D4D4D4"/>
+          <w:kern w:val="0"/>
+          <w:sz w:val="21"/>
+          <w:szCs w:val="21"/>
+          <w:lang w:eastAsia="pt-BR"/>
+          <w14:ligatures w14:val="none"/>
+        </w:rPr>
+      </w:pPr>
+      <w:r>
+        <w:rPr>
+          <w:rFonts w:ascii="Consolas" w:eastAsia="Times New Roman" w:hAnsi="Consolas" w:cs="Times New Roman"/>
+          <w:color w:val="D4D4D4"/>
+          <w:kern w:val="0"/>
+          <w:sz w:val="21"/>
+          <w:szCs w:val="21"/>
+          <w:lang w:eastAsia="pt-BR"/>
+          <w14:ligatures w14:val="none"/>
+        </w:rPr>
+        <w:t xml:space="preserve">            </w:t>
+      </w:r>
+      <w:proofErr w:type="spellStart"/>
+      <w:r>
+        <w:rPr>
+          <w:rFonts w:ascii="Consolas" w:eastAsia="Times New Roman" w:hAnsi="Consolas" w:cs="Times New Roman"/>
+          <w:color w:val="C586C0"/>
+          <w:kern w:val="0"/>
+          <w:sz w:val="21"/>
+          <w:szCs w:val="21"/>
+          <w:lang w:eastAsia="pt-BR"/>
+          <w14:ligatures w14:val="none"/>
+        </w:rPr>
+        <w:t>if</w:t>
+      </w:r>
+      <w:proofErr w:type="spellEnd"/>
+      <w:r>
+        <w:rPr>
+          <w:rFonts w:ascii="Consolas" w:eastAsia="Times New Roman" w:hAnsi="Consolas" w:cs="Times New Roman"/>
+          <w:color w:val="D4D4D4"/>
+          <w:kern w:val="0"/>
+          <w:sz w:val="21"/>
+          <w:szCs w:val="21"/>
+          <w:lang w:eastAsia="pt-BR"/>
+          <w14:ligatures w14:val="none"/>
+        </w:rPr>
+        <w:t xml:space="preserve"> (</w:t>
+      </w:r>
+      <w:proofErr w:type="spellStart"/>
+      <w:r>
+        <w:rPr>
+          <w:rFonts w:ascii="Consolas" w:eastAsia="Times New Roman" w:hAnsi="Consolas" w:cs="Times New Roman"/>
+          <w:color w:val="9CDCFE"/>
+          <w:kern w:val="0"/>
+          <w:sz w:val="21"/>
+          <w:szCs w:val="21"/>
+          <w:lang w:eastAsia="pt-BR"/>
+          <w14:ligatures w14:val="none"/>
+        </w:rPr>
+        <w:t>err</w:t>
+      </w:r>
+      <w:proofErr w:type="spellEnd"/>
+      <w:r>
+        <w:rPr>
+          <w:rFonts w:ascii="Consolas" w:eastAsia="Times New Roman" w:hAnsi="Consolas" w:cs="Times New Roman"/>
+          <w:color w:val="D4D4D4"/>
+          <w:kern w:val="0"/>
+          <w:sz w:val="21"/>
+          <w:szCs w:val="21"/>
+          <w:lang w:eastAsia="pt-BR"/>
+          <w14:ligatures w14:val="none"/>
+        </w:rPr>
+        <w:t>) {</w:t>
+      </w:r>
+    </w:p>
+    <w:p>
+      <w:pPr>
+        <w:shd w:val="clear" w:color="auto" w:fill="1E1E1E"/>
+        <w:spacing w:after="0" w:line="285" w:lineRule="atLeast"/>
+        <w:rPr>
+          <w:rFonts w:ascii="Consolas" w:eastAsia="Times New Roman" w:hAnsi="Consolas" w:cs="Times New Roman"/>
+          <w:color w:val="D4D4D4"/>
+          <w:kern w:val="0"/>
+          <w:sz w:val="21"/>
+          <w:szCs w:val="21"/>
+          <w:lang w:eastAsia="pt-BR"/>
+          <w14:ligatures w14:val="none"/>
+        </w:rPr>
+      </w:pPr>
+      <w:r>
+        <w:rPr>
+          <w:rFonts w:ascii="Consolas" w:eastAsia="Times New Roman" w:hAnsi="Consolas" w:cs="Times New Roman"/>
+          <w:color w:val="D4D4D4"/>
+          <w:kern w:val="0"/>
+          <w:sz w:val="21"/>
+          <w:szCs w:val="21"/>
+          <w:lang w:eastAsia="pt-BR"/>
+          <w14:ligatures w14:val="none"/>
+        </w:rPr>
+        <w:t xml:space="preserve">                </w:t>
+      </w:r>
+      <w:proofErr w:type="spellStart"/>
+      <w:proofErr w:type="gramStart"/>
+      <w:r>
+        <w:rPr>
+          <w:rFonts w:ascii="Consolas" w:eastAsia="Times New Roman" w:hAnsi="Consolas" w:cs="Times New Roman"/>
+          <w:color w:val="9CDCFE"/>
+          <w:kern w:val="0"/>
+          <w:sz w:val="21"/>
+          <w:szCs w:val="21"/>
+          <w:lang w:eastAsia="pt-BR"/>
+          <w14:ligatures w14:val="none"/>
+        </w:rPr>
+        <w:t>console</w:t>
+      </w:r>
+      <w:r>
+        <w:rPr>
+          <w:rFonts w:ascii="Consolas" w:eastAsia="Times New Roman" w:hAnsi="Consolas" w:cs="Times New Roman"/>
+          <w:color w:val="D4D4D4"/>
+          <w:kern w:val="0"/>
+          <w:sz w:val="21"/>
+          <w:szCs w:val="21"/>
+          <w:lang w:eastAsia="pt-BR"/>
+          <w14:ligatures w14:val="none"/>
+        </w:rPr>
+        <w:t>.</w:t>
+      </w:r>
+      <w:r>
+        <w:rPr>
+          <w:rFonts w:ascii="Consolas" w:eastAsia="Times New Roman" w:hAnsi="Consolas" w:cs="Times New Roman"/>
+          <w:color w:val="DCDCAA"/>
+          <w:kern w:val="0"/>
+          <w:sz w:val="21"/>
+          <w:szCs w:val="21"/>
+          <w:lang w:eastAsia="pt-BR"/>
+          <w14:ligatures w14:val="none"/>
+        </w:rPr>
+        <w:t>error</w:t>
+      </w:r>
+      <w:proofErr w:type="spellEnd"/>
+      <w:proofErr w:type="gramEnd"/>
+      <w:r>
+        <w:rPr>
+          <w:rFonts w:ascii="Consolas" w:eastAsia="Times New Roman" w:hAnsi="Consolas" w:cs="Times New Roman"/>
+          <w:color w:val="D4D4D4"/>
+          <w:kern w:val="0"/>
+          <w:sz w:val="21"/>
+          <w:szCs w:val="21"/>
+          <w:lang w:eastAsia="pt-BR"/>
+          <w14:ligatures w14:val="none"/>
+        </w:rPr>
+        <w:t>(</w:t>
+      </w:r>
+      <w:r>
+        <w:rPr>
+          <w:rFonts w:ascii="Consolas" w:eastAsia="Times New Roman" w:hAnsi="Consolas" w:cs="Times New Roman"/>
+          <w:color w:val="CE9178"/>
+          <w:kern w:val="0"/>
+          <w:sz w:val="21"/>
+          <w:szCs w:val="21"/>
+          <w:lang w:eastAsia="pt-BR"/>
+          <w14:ligatures w14:val="none"/>
+        </w:rPr>
+        <w:t>'Erro ao verificar usuário'</w:t>
+      </w:r>
+      <w:r>
+        <w:rPr>
+          <w:rFonts w:ascii="Consolas" w:eastAsia="Times New Roman" w:hAnsi="Consolas" w:cs="Times New Roman"/>
+          <w:color w:val="D4D4D4"/>
+          <w:kern w:val="0"/>
+          <w:sz w:val="21"/>
+          <w:szCs w:val="21"/>
+          <w:lang w:eastAsia="pt-BR"/>
+          <w14:ligatures w14:val="none"/>
+        </w:rPr>
+        <w:t xml:space="preserve">, </w:t>
+      </w:r>
+      <w:proofErr w:type="spellStart"/>
+      <w:r>
+        <w:rPr>
+          <w:rFonts w:ascii="Consolas" w:eastAsia="Times New Roman" w:hAnsi="Consolas" w:cs="Times New Roman"/>
+          <w:color w:val="9CDCFE"/>
+          <w:kern w:val="0"/>
+          <w:sz w:val="21"/>
+          <w:szCs w:val="21"/>
+          <w:lang w:eastAsia="pt-BR"/>
+          <w14:ligatures w14:val="none"/>
+        </w:rPr>
+        <w:t>err</w:t>
+      </w:r>
+      <w:r>
+        <w:rPr>
+          <w:rFonts w:ascii="Consolas" w:eastAsia="Times New Roman" w:hAnsi="Consolas" w:cs="Times New Roman"/>
+          <w:color w:val="D4D4D4"/>
+          <w:kern w:val="0"/>
+          <w:sz w:val="21"/>
+          <w:szCs w:val="21"/>
+          <w:lang w:eastAsia="pt-BR"/>
+          <w14:ligatures w14:val="none"/>
+        </w:rPr>
+        <w:t>.</w:t>
+      </w:r>
+      <w:r>
+        <w:rPr>
+          <w:rFonts w:ascii="Consolas" w:eastAsia="Times New Roman" w:hAnsi="Consolas" w:cs="Times New Roman"/>
+          <w:color w:val="9CDCFE"/>
+          <w:kern w:val="0"/>
+          <w:sz w:val="21"/>
+          <w:szCs w:val="21"/>
+          <w:lang w:eastAsia="pt-BR"/>
+          <w14:ligatures w14:val="none"/>
+        </w:rPr>
+        <w:t>message</w:t>
+      </w:r>
+      <w:proofErr w:type="spellEnd"/>
+      <w:r>
+        <w:rPr>
+          <w:rFonts w:ascii="Consolas" w:eastAsia="Times New Roman" w:hAnsi="Consolas" w:cs="Times New Roman"/>
+          <w:color w:val="D4D4D4"/>
+          <w:kern w:val="0"/>
+          <w:sz w:val="21"/>
+          <w:szCs w:val="21"/>
+          <w:lang w:eastAsia="pt-BR"/>
+          <w14:ligatures w14:val="none"/>
+        </w:rPr>
+        <w:t>);</w:t>
+      </w:r>
+    </w:p>
+    <w:p>
+      <w:pPr>
+        <w:shd w:val="clear" w:color="auto" w:fill="1E1E1E"/>
+        <w:spacing w:after="0" w:line="285" w:lineRule="atLeast"/>
+        <w:rPr>
+          <w:rFonts w:ascii="Consolas" w:eastAsia="Times New Roman" w:hAnsi="Consolas" w:cs="Times New Roman"/>
+          <w:color w:val="D4D4D4"/>
+          <w:kern w:val="0"/>
+          <w:sz w:val="21"/>
+          <w:szCs w:val="21"/>
+          <w:lang w:eastAsia="pt-BR"/>
+          <w14:ligatures w14:val="none"/>
+        </w:rPr>
+      </w:pPr>
+      <w:r>
+        <w:rPr>
+          <w:rFonts w:ascii="Consolas" w:eastAsia="Times New Roman" w:hAnsi="Consolas" w:cs="Times New Roman"/>
+          <w:color w:val="D4D4D4"/>
+          <w:kern w:val="0"/>
+          <w:sz w:val="21"/>
+          <w:szCs w:val="21"/>
+          <w:lang w:eastAsia="pt-BR"/>
+          <w14:ligatures w14:val="none"/>
+        </w:rPr>
+        <w:t xml:space="preserve">                </w:t>
+      </w:r>
+      <w:proofErr w:type="spellStart"/>
+      <w:r>
+        <w:rPr>
+          <w:rFonts w:ascii="Consolas" w:eastAsia="Times New Roman" w:hAnsi="Consolas" w:cs="Times New Roman"/>
+          <w:color w:val="C586C0"/>
+          <w:kern w:val="0"/>
+          <w:sz w:val="21"/>
+          <w:szCs w:val="21"/>
+          <w:lang w:eastAsia="pt-BR"/>
+          <w14:ligatures w14:val="none"/>
+        </w:rPr>
+        <w:t>return</w:t>
+      </w:r>
+      <w:proofErr w:type="spellEnd"/>
+      <w:r>
+        <w:rPr>
+          <w:rFonts w:ascii="Consolas" w:eastAsia="Times New Roman" w:hAnsi="Consolas" w:cs="Times New Roman"/>
+          <w:color w:val="D4D4D4"/>
+          <w:kern w:val="0"/>
+          <w:sz w:val="21"/>
+          <w:szCs w:val="21"/>
+          <w:lang w:eastAsia="pt-BR"/>
+          <w14:ligatures w14:val="none"/>
+        </w:rPr>
+        <w:t xml:space="preserve"> </w:t>
+      </w:r>
+      <w:proofErr w:type="spellStart"/>
+      <w:proofErr w:type="gramStart"/>
+      <w:r>
+        <w:rPr>
+          <w:rFonts w:ascii="Consolas" w:eastAsia="Times New Roman" w:hAnsi="Consolas" w:cs="Times New Roman"/>
+          <w:color w:val="9CDCFE"/>
+          <w:kern w:val="0"/>
+          <w:sz w:val="21"/>
+          <w:szCs w:val="21"/>
+          <w:lang w:eastAsia="pt-BR"/>
+          <w14:ligatures w14:val="none"/>
+        </w:rPr>
+        <w:t>res</w:t>
+      </w:r>
+      <w:r>
+        <w:rPr>
+          <w:rFonts w:ascii="Consolas" w:eastAsia="Times New Roman" w:hAnsi="Consolas" w:cs="Times New Roman"/>
+          <w:color w:val="D4D4D4"/>
+          <w:kern w:val="0"/>
+          <w:sz w:val="21"/>
+          <w:szCs w:val="21"/>
+          <w:lang w:eastAsia="pt-BR"/>
+          <w14:ligatures w14:val="none"/>
+        </w:rPr>
+        <w:t>.</w:t>
+      </w:r>
+      <w:r>
+        <w:rPr>
+          <w:rFonts w:ascii="Consolas" w:eastAsia="Times New Roman" w:hAnsi="Consolas" w:cs="Times New Roman"/>
+          <w:color w:val="DCDCAA"/>
+          <w:kern w:val="0"/>
+          <w:sz w:val="21"/>
+          <w:szCs w:val="21"/>
+          <w:lang w:eastAsia="pt-BR"/>
+          <w14:ligatures w14:val="none"/>
+        </w:rPr>
+        <w:t>status</w:t>
+      </w:r>
+      <w:proofErr w:type="spellEnd"/>
+      <w:proofErr w:type="gramEnd"/>
+      <w:r>
+        <w:rPr>
+          <w:rFonts w:ascii="Consolas" w:eastAsia="Times New Roman" w:hAnsi="Consolas" w:cs="Times New Roman"/>
+          <w:color w:val="D4D4D4"/>
+          <w:kern w:val="0"/>
+          <w:sz w:val="21"/>
+          <w:szCs w:val="21"/>
+          <w:lang w:eastAsia="pt-BR"/>
+          <w14:ligatures w14:val="none"/>
+        </w:rPr>
+        <w:t>(</w:t>
+      </w:r>
+      <w:r>
+        <w:rPr>
+          <w:rFonts w:ascii="Consolas" w:eastAsia="Times New Roman" w:hAnsi="Consolas" w:cs="Times New Roman"/>
+          <w:color w:val="B5CEA8"/>
+          <w:kern w:val="0"/>
+          <w:sz w:val="21"/>
+          <w:szCs w:val="21"/>
+          <w:lang w:eastAsia="pt-BR"/>
+          <w14:ligatures w14:val="none"/>
+        </w:rPr>
+        <w:t>500</w:t>
+      </w:r>
+      <w:r>
+        <w:rPr>
+          <w:rFonts w:ascii="Consolas" w:eastAsia="Times New Roman" w:hAnsi="Consolas" w:cs="Times New Roman"/>
+          <w:color w:val="D4D4D4"/>
+          <w:kern w:val="0"/>
+          <w:sz w:val="21"/>
+          <w:szCs w:val="21"/>
+          <w:lang w:eastAsia="pt-BR"/>
+          <w14:ligatures w14:val="none"/>
+        </w:rPr>
+        <w:t>).</w:t>
+      </w:r>
+      <w:proofErr w:type="spellStart"/>
+      <w:r>
+        <w:rPr>
+          <w:rFonts w:ascii="Consolas" w:eastAsia="Times New Roman" w:hAnsi="Consolas" w:cs="Times New Roman"/>
+          <w:color w:val="DCDCAA"/>
+          <w:kern w:val="0"/>
+          <w:sz w:val="21"/>
+          <w:szCs w:val="21"/>
+          <w:lang w:eastAsia="pt-BR"/>
+          <w14:ligatures w14:val="none"/>
+        </w:rPr>
+        <w:t>json</w:t>
+      </w:r>
+      <w:proofErr w:type="spellEnd"/>
+      <w:r>
+        <w:rPr>
+          <w:rFonts w:ascii="Consolas" w:eastAsia="Times New Roman" w:hAnsi="Consolas" w:cs="Times New Roman"/>
+          <w:color w:val="D4D4D4"/>
+          <w:kern w:val="0"/>
+          <w:sz w:val="21"/>
+          <w:szCs w:val="21"/>
+          <w:lang w:eastAsia="pt-BR"/>
+          <w14:ligatures w14:val="none"/>
+        </w:rPr>
+        <w:t xml:space="preserve">({ </w:t>
+      </w:r>
+      <w:proofErr w:type="spellStart"/>
+      <w:r>
+        <w:rPr>
+          <w:rFonts w:ascii="Consolas" w:eastAsia="Times New Roman" w:hAnsi="Consolas" w:cs="Times New Roman"/>
+          <w:color w:val="9CDCFE"/>
+          <w:kern w:val="0"/>
+          <w:sz w:val="21"/>
+          <w:szCs w:val="21"/>
+          <w:lang w:eastAsia="pt-BR"/>
+          <w14:ligatures w14:val="none"/>
+        </w:rPr>
+        <w:t>message</w:t>
+      </w:r>
+      <w:proofErr w:type="spellEnd"/>
+      <w:r>
+        <w:rPr>
+          <w:rFonts w:ascii="Consolas" w:eastAsia="Times New Roman" w:hAnsi="Consolas" w:cs="Times New Roman"/>
+          <w:color w:val="9CDCFE"/>
+          <w:kern w:val="0"/>
+          <w:sz w:val="21"/>
+          <w:szCs w:val="21"/>
+          <w:lang w:eastAsia="pt-BR"/>
+          <w14:ligatures w14:val="none"/>
+        </w:rPr>
+        <w:t>:</w:t>
+      </w:r>
+      <w:r>
+        <w:rPr>
+          <w:rFonts w:ascii="Consolas" w:eastAsia="Times New Roman" w:hAnsi="Consolas" w:cs="Times New Roman"/>
+          <w:color w:val="D4D4D4"/>
+          <w:kern w:val="0"/>
+          <w:sz w:val="21"/>
+          <w:szCs w:val="21"/>
+          <w:lang w:eastAsia="pt-BR"/>
+          <w14:ligatures w14:val="none"/>
+        </w:rPr>
+        <w:t xml:space="preserve"> </w:t>
+      </w:r>
+      <w:r>
+        <w:rPr>
+          <w:rFonts w:ascii="Consolas" w:eastAsia="Times New Roman" w:hAnsi="Consolas" w:cs="Times New Roman"/>
+          <w:color w:val="CE9178"/>
+          <w:kern w:val="0"/>
+          <w:sz w:val="21"/>
+          <w:szCs w:val="21"/>
+          <w:lang w:eastAsia="pt-BR"/>
+          <w14:ligatures w14:val="none"/>
+        </w:rPr>
+        <w:t>'Erro ao verificar usuário'</w:t>
+      </w:r>
+      <w:r>
+        <w:rPr>
+          <w:rFonts w:ascii="Consolas" w:eastAsia="Times New Roman" w:hAnsi="Consolas" w:cs="Times New Roman"/>
+          <w:color w:val="D4D4D4"/>
+          <w:kern w:val="0"/>
+          <w:sz w:val="21"/>
+          <w:szCs w:val="21"/>
+          <w:lang w:eastAsia="pt-BR"/>
+          <w14:ligatures w14:val="none"/>
+        </w:rPr>
+        <w:t>});</w:t>
+      </w:r>
+    </w:p>
+    <w:p>
+      <w:pPr>
+        <w:shd w:val="clear" w:color="auto" w:fill="1E1E1E"/>
+        <w:spacing w:after="0" w:line="285" w:lineRule="atLeast"/>
+        <w:rPr>
+          <w:rFonts w:ascii="Consolas" w:eastAsia="Times New Roman" w:hAnsi="Consolas" w:cs="Times New Roman"/>
+          <w:color w:val="D4D4D4"/>
+          <w:kern w:val="0"/>
+          <w:sz w:val="21"/>
+          <w:szCs w:val="21"/>
+          <w:lang w:eastAsia="pt-BR"/>
+          <w14:ligatures w14:val="none"/>
+        </w:rPr>
+      </w:pPr>
+      <w:r>
+        <w:rPr>
+          <w:rFonts w:ascii="Consolas" w:eastAsia="Times New Roman" w:hAnsi="Consolas" w:cs="Times New Roman"/>
+          <w:color w:val="D4D4D4"/>
+          <w:kern w:val="0"/>
+          <w:sz w:val="21"/>
+          <w:szCs w:val="21"/>
+          <w:lang w:eastAsia="pt-BR"/>
+          <w14:ligatures w14:val="none"/>
+        </w:rPr>
+        <w:t>            }</w:t>
+      </w:r>
+    </w:p>
+    <w:p>
+      <w:pPr>
+        <w:shd w:val="clear" w:color="auto" w:fill="1E1E1E"/>
+        <w:spacing w:after="0" w:line="285" w:lineRule="atLeast"/>
+        <w:rPr>
+          <w:rFonts w:ascii="Consolas" w:eastAsia="Times New Roman" w:hAnsi="Consolas" w:cs="Times New Roman"/>
+          <w:color w:val="D4D4D4"/>
+          <w:kern w:val="0"/>
+          <w:sz w:val="21"/>
+          <w:szCs w:val="21"/>
+          <w:lang w:eastAsia="pt-BR"/>
+          <w14:ligatures w14:val="none"/>
+        </w:rPr>
+      </w:pPr>
+    </w:p>
+    <w:p>
+      <w:pPr>
+        <w:shd w:val="clear" w:color="auto" w:fill="1E1E1E"/>
+        <w:spacing w:after="0" w:line="285" w:lineRule="atLeast"/>
+        <w:rPr>
+          <w:rFonts w:ascii="Consolas" w:eastAsia="Times New Roman" w:hAnsi="Consolas" w:cs="Times New Roman"/>
+          <w:color w:val="D4D4D4"/>
+          <w:kern w:val="0"/>
+          <w:sz w:val="21"/>
+          <w:szCs w:val="21"/>
+          <w:lang w:eastAsia="pt-BR"/>
+          <w14:ligatures w14:val="none"/>
+        </w:rPr>
+      </w:pPr>
+      <w:r>
+        <w:rPr>
+          <w:rFonts w:ascii="Consolas" w:eastAsia="Times New Roman" w:hAnsi="Consolas" w:cs="Times New Roman"/>
+          <w:color w:val="D4D4D4"/>
+          <w:kern w:val="0"/>
+          <w:sz w:val="21"/>
+          <w:szCs w:val="21"/>
+          <w:lang w:eastAsia="pt-BR"/>
+          <w14:ligatures w14:val="none"/>
+        </w:rPr>
+        <w:t xml:space="preserve">            </w:t>
+      </w:r>
+      <w:proofErr w:type="spellStart"/>
+      <w:r>
+        <w:rPr>
+          <w:rFonts w:ascii="Consolas" w:eastAsia="Times New Roman" w:hAnsi="Consolas" w:cs="Times New Roman"/>
+          <w:color w:val="C586C0"/>
+          <w:kern w:val="0"/>
+          <w:sz w:val="21"/>
+          <w:szCs w:val="21"/>
+          <w:lang w:eastAsia="pt-BR"/>
+          <w14:ligatures w14:val="none"/>
+        </w:rPr>
+        <w:t>if</w:t>
+      </w:r>
+      <w:proofErr w:type="spellEnd"/>
+      <w:r>
+        <w:rPr>
+          <w:rFonts w:ascii="Consolas" w:eastAsia="Times New Roman" w:hAnsi="Consolas" w:cs="Times New Roman"/>
+          <w:color w:val="D4D4D4"/>
+          <w:kern w:val="0"/>
+          <w:sz w:val="21"/>
+          <w:szCs w:val="21"/>
+          <w:lang w:eastAsia="pt-BR"/>
+          <w14:ligatures w14:val="none"/>
+        </w:rPr>
+        <w:t xml:space="preserve"> </w:t>
+      </w:r>
+      <w:proofErr w:type="gramStart"/>
+      <w:r>
+        <w:rPr>
+          <w:rFonts w:ascii="Consolas" w:eastAsia="Times New Roman" w:hAnsi="Consolas" w:cs="Times New Roman"/>
+          <w:color w:val="D4D4D4"/>
+          <w:kern w:val="0"/>
+          <w:sz w:val="21"/>
+          <w:szCs w:val="21"/>
+          <w:lang w:eastAsia="pt-BR"/>
+          <w14:ligatures w14:val="none"/>
+        </w:rPr>
+        <w:t>(!</w:t>
+      </w:r>
+      <w:proofErr w:type="spellStart"/>
+      <w:r>
+        <w:rPr>
+          <w:rFonts w:ascii="Consolas" w:eastAsia="Times New Roman" w:hAnsi="Consolas" w:cs="Times New Roman"/>
+          <w:color w:val="9CDCFE"/>
+          <w:kern w:val="0"/>
+          <w:sz w:val="21"/>
+          <w:szCs w:val="21"/>
+          <w:lang w:eastAsia="pt-BR"/>
+          <w14:ligatures w14:val="none"/>
+        </w:rPr>
+        <w:t>user</w:t>
+      </w:r>
+      <w:proofErr w:type="spellEnd"/>
+      <w:proofErr w:type="gramEnd"/>
+      <w:r>
+        <w:rPr>
+          <w:rFonts w:ascii="Consolas" w:eastAsia="Times New Roman" w:hAnsi="Consolas" w:cs="Times New Roman"/>
+          <w:color w:val="D4D4D4"/>
+          <w:kern w:val="0"/>
+          <w:sz w:val="21"/>
+          <w:szCs w:val="21"/>
+          <w:lang w:eastAsia="pt-BR"/>
+          <w14:ligatures w14:val="none"/>
+        </w:rPr>
+        <w:t>) {</w:t>
+      </w:r>
+    </w:p>
+    <w:p>
+      <w:pPr>
+        <w:shd w:val="clear" w:color="auto" w:fill="1E1E1E"/>
+        <w:spacing w:after="0" w:line="285" w:lineRule="atLeast"/>
+        <w:rPr>
+          <w:rFonts w:ascii="Consolas" w:eastAsia="Times New Roman" w:hAnsi="Consolas" w:cs="Times New Roman"/>
+          <w:color w:val="D4D4D4"/>
+          <w:kern w:val="0"/>
+          <w:sz w:val="21"/>
+          <w:szCs w:val="21"/>
+          <w:lang w:eastAsia="pt-BR"/>
+          <w14:ligatures w14:val="none"/>
+        </w:rPr>
+      </w:pPr>
+      <w:r>
+        <w:rPr>
+          <w:rFonts w:ascii="Consolas" w:eastAsia="Times New Roman" w:hAnsi="Consolas" w:cs="Times New Roman"/>
+          <w:color w:val="D4D4D4"/>
+          <w:kern w:val="0"/>
+          <w:sz w:val="21"/>
+          <w:szCs w:val="21"/>
+          <w:lang w:eastAsia="pt-BR"/>
+          <w14:ligatures w14:val="none"/>
+        </w:rPr>
+        <w:t xml:space="preserve">                </w:t>
+      </w:r>
+      <w:proofErr w:type="spellStart"/>
+      <w:r>
+        <w:rPr>
+          <w:rFonts w:ascii="Consolas" w:eastAsia="Times New Roman" w:hAnsi="Consolas" w:cs="Times New Roman"/>
+          <w:color w:val="C586C0"/>
+          <w:kern w:val="0"/>
+          <w:sz w:val="21"/>
+          <w:szCs w:val="21"/>
+          <w:lang w:eastAsia="pt-BR"/>
+          <w14:ligatures w14:val="none"/>
+        </w:rPr>
+        <w:t>return</w:t>
+      </w:r>
+      <w:proofErr w:type="spellEnd"/>
+      <w:r>
+        <w:rPr>
+          <w:rFonts w:ascii="Consolas" w:eastAsia="Times New Roman" w:hAnsi="Consolas" w:cs="Times New Roman"/>
+          <w:color w:val="D4D4D4"/>
+          <w:kern w:val="0"/>
+          <w:sz w:val="21"/>
+          <w:szCs w:val="21"/>
+          <w:lang w:eastAsia="pt-BR"/>
+          <w14:ligatures w14:val="none"/>
+        </w:rPr>
+        <w:t xml:space="preserve"> </w:t>
+      </w:r>
+      <w:proofErr w:type="spellStart"/>
+      <w:proofErr w:type="gramStart"/>
+      <w:r>
+        <w:rPr>
+          <w:rFonts w:ascii="Consolas" w:eastAsia="Times New Roman" w:hAnsi="Consolas" w:cs="Times New Roman"/>
+          <w:color w:val="9CDCFE"/>
+          <w:kern w:val="0"/>
+          <w:sz w:val="21"/>
+          <w:szCs w:val="21"/>
+          <w:lang w:eastAsia="pt-BR"/>
+          <w14:ligatures w14:val="none"/>
+        </w:rPr>
+        <w:t>res</w:t>
+      </w:r>
+      <w:r>
+        <w:rPr>
+          <w:rFonts w:ascii="Consolas" w:eastAsia="Times New Roman" w:hAnsi="Consolas" w:cs="Times New Roman"/>
+          <w:color w:val="D4D4D4"/>
+          <w:kern w:val="0"/>
+          <w:sz w:val="21"/>
+          <w:szCs w:val="21"/>
+          <w:lang w:eastAsia="pt-BR"/>
+          <w14:ligatures w14:val="none"/>
+        </w:rPr>
+        <w:t>.</w:t>
+      </w:r>
+      <w:r>
+        <w:rPr>
+          <w:rFonts w:ascii="Consolas" w:eastAsia="Times New Roman" w:hAnsi="Consolas" w:cs="Times New Roman"/>
+          <w:color w:val="DCDCAA"/>
+          <w:kern w:val="0"/>
+          <w:sz w:val="21"/>
+          <w:szCs w:val="21"/>
+          <w:lang w:eastAsia="pt-BR"/>
+          <w14:ligatures w14:val="none"/>
+        </w:rPr>
+        <w:t>status</w:t>
+      </w:r>
+      <w:proofErr w:type="spellEnd"/>
+      <w:proofErr w:type="gramEnd"/>
+      <w:r>
+        <w:rPr>
+          <w:rFonts w:ascii="Consolas" w:eastAsia="Times New Roman" w:hAnsi="Consolas" w:cs="Times New Roman"/>
+          <w:color w:val="D4D4D4"/>
+          <w:kern w:val="0"/>
+          <w:sz w:val="21"/>
+          <w:szCs w:val="21"/>
+          <w:lang w:eastAsia="pt-BR"/>
+          <w14:ligatures w14:val="none"/>
+        </w:rPr>
+        <w:t>(</w:t>
+      </w:r>
+      <w:r>
+        <w:rPr>
+          <w:rFonts w:ascii="Consolas" w:eastAsia="Times New Roman" w:hAnsi="Consolas" w:cs="Times New Roman"/>
+          <w:color w:val="B5CEA8"/>
+          <w:kern w:val="0"/>
+          <w:sz w:val="21"/>
+          <w:szCs w:val="21"/>
+          <w:lang w:eastAsia="pt-BR"/>
+          <w14:ligatures w14:val="none"/>
+        </w:rPr>
+        <w:t>400</w:t>
+      </w:r>
+      <w:r>
+        <w:rPr>
+          <w:rFonts w:ascii="Consolas" w:eastAsia="Times New Roman" w:hAnsi="Consolas" w:cs="Times New Roman"/>
+          <w:color w:val="D4D4D4"/>
+          <w:kern w:val="0"/>
+          <w:sz w:val="21"/>
+          <w:szCs w:val="21"/>
+          <w:lang w:eastAsia="pt-BR"/>
+          <w14:ligatures w14:val="none"/>
+        </w:rPr>
+        <w:t>).</w:t>
+      </w:r>
+      <w:proofErr w:type="spellStart"/>
+      <w:r>
+        <w:rPr>
+          <w:rFonts w:ascii="Consolas" w:eastAsia="Times New Roman" w:hAnsi="Consolas" w:cs="Times New Roman"/>
+          <w:color w:val="DCDCAA"/>
+          <w:kern w:val="0"/>
+          <w:sz w:val="21"/>
+          <w:szCs w:val="21"/>
+          <w:lang w:eastAsia="pt-BR"/>
+          <w14:ligatures w14:val="none"/>
+        </w:rPr>
+        <w:t>json</w:t>
+      </w:r>
+      <w:proofErr w:type="spellEnd"/>
+      <w:r>
+        <w:rPr>
+          <w:rFonts w:ascii="Consolas" w:eastAsia="Times New Roman" w:hAnsi="Consolas" w:cs="Times New Roman"/>
+          <w:color w:val="D4D4D4"/>
+          <w:kern w:val="0"/>
+          <w:sz w:val="21"/>
+          <w:szCs w:val="21"/>
+          <w:lang w:eastAsia="pt-BR"/>
+          <w14:ligatures w14:val="none"/>
+        </w:rPr>
+        <w:t xml:space="preserve">({ </w:t>
+      </w:r>
+      <w:proofErr w:type="spellStart"/>
+      <w:r>
+        <w:rPr>
+          <w:rFonts w:ascii="Consolas" w:eastAsia="Times New Roman" w:hAnsi="Consolas" w:cs="Times New Roman"/>
+          <w:color w:val="9CDCFE"/>
+          <w:kern w:val="0"/>
+          <w:sz w:val="21"/>
+          <w:szCs w:val="21"/>
+          <w:lang w:eastAsia="pt-BR"/>
+          <w14:ligatures w14:val="none"/>
+        </w:rPr>
+        <w:t>error</w:t>
+      </w:r>
+      <w:proofErr w:type="spellEnd"/>
+      <w:r>
+        <w:rPr>
+          <w:rFonts w:ascii="Consolas" w:eastAsia="Times New Roman" w:hAnsi="Consolas" w:cs="Times New Roman"/>
+          <w:color w:val="9CDCFE"/>
+          <w:kern w:val="0"/>
+          <w:sz w:val="21"/>
+          <w:szCs w:val="21"/>
+          <w:lang w:eastAsia="pt-BR"/>
+          <w14:ligatures w14:val="none"/>
+        </w:rPr>
+        <w:t>:</w:t>
+      </w:r>
+      <w:r>
+        <w:rPr>
+          <w:rFonts w:ascii="Consolas" w:eastAsia="Times New Roman" w:hAnsi="Consolas" w:cs="Times New Roman"/>
+          <w:color w:val="D4D4D4"/>
+          <w:kern w:val="0"/>
+          <w:sz w:val="21"/>
+          <w:szCs w:val="21"/>
+          <w:lang w:eastAsia="pt-BR"/>
+          <w14:ligatures w14:val="none"/>
+        </w:rPr>
+        <w:t xml:space="preserve"> </w:t>
+      </w:r>
+      <w:r>
+        <w:rPr>
+          <w:rFonts w:ascii="Consolas" w:eastAsia="Times New Roman" w:hAnsi="Consolas" w:cs="Times New Roman"/>
+          <w:color w:val="CE9178"/>
+          <w:kern w:val="0"/>
+          <w:sz w:val="21"/>
+          <w:szCs w:val="21"/>
+          <w:lang w:eastAsia="pt-BR"/>
+          <w14:ligatures w14:val="none"/>
+        </w:rPr>
+        <w:t>'Credenciais inválidas'</w:t>
+      </w:r>
+      <w:r>
+        <w:rPr>
+          <w:rFonts w:ascii="Consolas" w:eastAsia="Times New Roman" w:hAnsi="Consolas" w:cs="Times New Roman"/>
+          <w:color w:val="D4D4D4"/>
+          <w:kern w:val="0"/>
+          <w:sz w:val="21"/>
+          <w:szCs w:val="21"/>
+          <w:lang w:eastAsia="pt-BR"/>
+          <w14:ligatures w14:val="none"/>
+        </w:rPr>
+        <w:t>});</w:t>
+      </w:r>
+    </w:p>
+    <w:p>
+      <w:pPr>
+        <w:shd w:val="clear" w:color="auto" w:fill="1E1E1E"/>
+        <w:spacing w:after="0" w:line="285" w:lineRule="atLeast"/>
+        <w:rPr>
+          <w:rFonts w:ascii="Consolas" w:eastAsia="Times New Roman" w:hAnsi="Consolas" w:cs="Times New Roman"/>
+          <w:color w:val="D4D4D4"/>
+          <w:kern w:val="0"/>
+          <w:sz w:val="21"/>
+          <w:szCs w:val="21"/>
+          <w:lang w:eastAsia="pt-BR"/>
+          <w14:ligatures w14:val="none"/>
+        </w:rPr>
+      </w:pPr>
+      <w:r>
+        <w:rPr>
+          <w:rFonts w:ascii="Consolas" w:eastAsia="Times New Roman" w:hAnsi="Consolas" w:cs="Times New Roman"/>
+          <w:color w:val="D4D4D4"/>
+          <w:kern w:val="0"/>
+          <w:sz w:val="21"/>
+          <w:szCs w:val="21"/>
+          <w:lang w:eastAsia="pt-BR"/>
+          <w14:ligatures w14:val="none"/>
+        </w:rPr>
+        <w:t>            }</w:t>
+      </w:r>
+    </w:p>
+    <w:p>
+      <w:pPr>
+        <w:shd w:val="clear" w:color="auto" w:fill="1E1E1E"/>
+        <w:spacing w:after="0" w:line="285" w:lineRule="atLeast"/>
+        <w:rPr>
+          <w:rFonts w:ascii="Consolas" w:eastAsia="Times New Roman" w:hAnsi="Consolas" w:cs="Times New Roman"/>
+          <w:color w:val="D4D4D4"/>
+          <w:kern w:val="0"/>
+          <w:sz w:val="21"/>
+          <w:szCs w:val="21"/>
+          <w:lang w:eastAsia="pt-BR"/>
+          <w14:ligatures w14:val="none"/>
+        </w:rPr>
+      </w:pPr>
+    </w:p>
+    <w:p>
+      <w:pPr>
+        <w:shd w:val="clear" w:color="auto" w:fill="1E1E1E"/>
+        <w:spacing w:after="0" w:line="285" w:lineRule="atLeast"/>
+        <w:rPr>
+          <w:rFonts w:ascii="Consolas" w:eastAsia="Times New Roman" w:hAnsi="Consolas" w:cs="Times New Roman"/>
+          <w:color w:val="D4D4D4"/>
+          <w:kern w:val="0"/>
+          <w:sz w:val="21"/>
+          <w:szCs w:val="21"/>
+          <w:lang w:eastAsia="pt-BR"/>
+          <w14:ligatures w14:val="none"/>
+        </w:rPr>
+      </w:pPr>
+      <w:r>
+        <w:rPr>
+          <w:rFonts w:ascii="Consolas" w:eastAsia="Times New Roman" w:hAnsi="Consolas" w:cs="Times New Roman"/>
+          <w:color w:val="D4D4D4"/>
+          <w:kern w:val="0"/>
+          <w:sz w:val="21"/>
+          <w:szCs w:val="21"/>
+          <w:lang w:eastAsia="pt-BR"/>
+          <w14:ligatures w14:val="none"/>
+        </w:rPr>
+        <w:t xml:space="preserve">            </w:t>
+      </w:r>
+      <w:proofErr w:type="spellStart"/>
+      <w:r>
+        <w:rPr>
+          <w:rFonts w:ascii="Consolas" w:eastAsia="Times New Roman" w:hAnsi="Consolas" w:cs="Times New Roman"/>
+          <w:color w:val="569CD6"/>
+          <w:kern w:val="0"/>
+          <w:sz w:val="21"/>
+          <w:szCs w:val="21"/>
+          <w:lang w:eastAsia="pt-BR"/>
+          <w14:ligatures w14:val="none"/>
+        </w:rPr>
+        <w:t>const</w:t>
+      </w:r>
+      <w:proofErr w:type="spellEnd"/>
+      <w:r>
+        <w:rPr>
+          <w:rFonts w:ascii="Consolas" w:eastAsia="Times New Roman" w:hAnsi="Consolas" w:cs="Times New Roman"/>
+          <w:color w:val="D4D4D4"/>
+          <w:kern w:val="0"/>
+          <w:sz w:val="21"/>
+          <w:szCs w:val="21"/>
+          <w:lang w:eastAsia="pt-BR"/>
+          <w14:ligatures w14:val="none"/>
+        </w:rPr>
+        <w:t xml:space="preserve"> </w:t>
+      </w:r>
+      <w:proofErr w:type="spellStart"/>
+      <w:r>
+        <w:rPr>
+          <w:rFonts w:ascii="Consolas" w:eastAsia="Times New Roman" w:hAnsi="Consolas" w:cs="Times New Roman"/>
+          <w:color w:val="4FC1FF"/>
+          <w:kern w:val="0"/>
+          <w:sz w:val="21"/>
+          <w:szCs w:val="21"/>
+          <w:lang w:eastAsia="pt-BR"/>
+          <w14:ligatures w14:val="none"/>
+        </w:rPr>
+        <w:t>isMatch</w:t>
+      </w:r>
+      <w:proofErr w:type="spellEnd"/>
+      <w:r>
+        <w:rPr>
+          <w:rFonts w:ascii="Consolas" w:eastAsia="Times New Roman" w:hAnsi="Consolas" w:cs="Times New Roman"/>
+          <w:color w:val="D4D4D4"/>
+          <w:kern w:val="0"/>
+          <w:sz w:val="21"/>
+          <w:szCs w:val="21"/>
+          <w:lang w:eastAsia="pt-BR"/>
+          <w14:ligatures w14:val="none"/>
+        </w:rPr>
+        <w:t xml:space="preserve"> = </w:t>
+      </w:r>
+      <w:proofErr w:type="spellStart"/>
+      <w:r>
+        <w:rPr>
+          <w:rFonts w:ascii="Consolas" w:eastAsia="Times New Roman" w:hAnsi="Consolas" w:cs="Times New Roman"/>
+          <w:color w:val="C586C0"/>
+          <w:kern w:val="0"/>
+          <w:sz w:val="21"/>
+          <w:szCs w:val="21"/>
+          <w:lang w:eastAsia="pt-BR"/>
+          <w14:ligatures w14:val="none"/>
+        </w:rPr>
+        <w:t>await</w:t>
+      </w:r>
+      <w:proofErr w:type="spellEnd"/>
+      <w:r>
+        <w:rPr>
+          <w:rFonts w:ascii="Consolas" w:eastAsia="Times New Roman" w:hAnsi="Consolas" w:cs="Times New Roman"/>
+          <w:color w:val="D4D4D4"/>
+          <w:kern w:val="0"/>
+          <w:sz w:val="21"/>
+          <w:szCs w:val="21"/>
+          <w:lang w:eastAsia="pt-BR"/>
+          <w14:ligatures w14:val="none"/>
+        </w:rPr>
+        <w:t xml:space="preserve"> </w:t>
+      </w:r>
+      <w:proofErr w:type="spellStart"/>
+      <w:proofErr w:type="gramStart"/>
+      <w:r>
+        <w:rPr>
+          <w:rFonts w:ascii="Consolas" w:eastAsia="Times New Roman" w:hAnsi="Consolas" w:cs="Times New Roman"/>
+          <w:color w:val="9CDCFE"/>
+          <w:kern w:val="0"/>
+          <w:sz w:val="21"/>
+          <w:szCs w:val="21"/>
+          <w:lang w:eastAsia="pt-BR"/>
+          <w14:ligatures w14:val="none"/>
+        </w:rPr>
+        <w:t>bcrypt</w:t>
+      </w:r>
+      <w:r>
+        <w:rPr>
+          <w:rFonts w:ascii="Consolas" w:eastAsia="Times New Roman" w:hAnsi="Consolas" w:cs="Times New Roman"/>
+          <w:color w:val="D4D4D4"/>
+          <w:kern w:val="0"/>
+          <w:sz w:val="21"/>
+          <w:szCs w:val="21"/>
+          <w:lang w:eastAsia="pt-BR"/>
+          <w14:ligatures w14:val="none"/>
+        </w:rPr>
+        <w:t>.</w:t>
+      </w:r>
+      <w:r>
+        <w:rPr>
+          <w:rFonts w:ascii="Consolas" w:eastAsia="Times New Roman" w:hAnsi="Consolas" w:cs="Times New Roman"/>
+          <w:color w:val="DCDCAA"/>
+          <w:kern w:val="0"/>
+          <w:sz w:val="21"/>
+          <w:szCs w:val="21"/>
+          <w:lang w:eastAsia="pt-BR"/>
+          <w14:ligatures w14:val="none"/>
+        </w:rPr>
+        <w:t>compare</w:t>
+      </w:r>
+      <w:proofErr w:type="spellEnd"/>
+      <w:proofErr w:type="gramEnd"/>
+      <w:r>
+        <w:rPr>
+          <w:rFonts w:ascii="Consolas" w:eastAsia="Times New Roman" w:hAnsi="Consolas" w:cs="Times New Roman"/>
+          <w:color w:val="D4D4D4"/>
+          <w:kern w:val="0"/>
+          <w:sz w:val="21"/>
+          <w:szCs w:val="21"/>
+          <w:lang w:eastAsia="pt-BR"/>
+          <w14:ligatures w14:val="none"/>
+        </w:rPr>
+        <w:t>(</w:t>
+      </w:r>
+      <w:r>
+        <w:rPr>
+          <w:rFonts w:ascii="Consolas" w:eastAsia="Times New Roman" w:hAnsi="Consolas" w:cs="Times New Roman"/>
+          <w:color w:val="4FC1FF"/>
+          <w:kern w:val="0"/>
+          <w:sz w:val="21"/>
+          <w:szCs w:val="21"/>
+          <w:lang w:eastAsia="pt-BR"/>
+          <w14:ligatures w14:val="none"/>
+        </w:rPr>
+        <w:t>senha</w:t>
+      </w:r>
+      <w:r>
+        <w:rPr>
+          <w:rFonts w:ascii="Consolas" w:eastAsia="Times New Roman" w:hAnsi="Consolas" w:cs="Times New Roman"/>
+          <w:color w:val="D4D4D4"/>
+          <w:kern w:val="0"/>
+          <w:sz w:val="21"/>
+          <w:szCs w:val="21"/>
+          <w:lang w:eastAsia="pt-BR"/>
+          <w14:ligatures w14:val="none"/>
+        </w:rPr>
+        <w:t xml:space="preserve">, </w:t>
+      </w:r>
+      <w:proofErr w:type="spellStart"/>
+      <w:r>
+        <w:rPr>
+          <w:rFonts w:ascii="Consolas" w:eastAsia="Times New Roman" w:hAnsi="Consolas" w:cs="Times New Roman"/>
+          <w:color w:val="9CDCFE"/>
+          <w:kern w:val="0"/>
+          <w:sz w:val="21"/>
+          <w:szCs w:val="21"/>
+          <w:lang w:eastAsia="pt-BR"/>
+          <w14:ligatures w14:val="none"/>
+        </w:rPr>
+        <w:t>user</w:t>
+      </w:r>
+      <w:r>
+        <w:rPr>
+          <w:rFonts w:ascii="Consolas" w:eastAsia="Times New Roman" w:hAnsi="Consolas" w:cs="Times New Roman"/>
+          <w:color w:val="D4D4D4"/>
+          <w:kern w:val="0"/>
+          <w:sz w:val="21"/>
+          <w:szCs w:val="21"/>
+          <w:lang w:eastAsia="pt-BR"/>
+          <w14:ligatures w14:val="none"/>
+        </w:rPr>
+        <w:t>.</w:t>
+      </w:r>
+      <w:r>
+        <w:rPr>
+          <w:rFonts w:ascii="Consolas" w:eastAsia="Times New Roman" w:hAnsi="Consolas" w:cs="Times New Roman"/>
+          <w:color w:val="9CDCFE"/>
+          <w:kern w:val="0"/>
+          <w:sz w:val="21"/>
+          <w:szCs w:val="21"/>
+          <w:lang w:eastAsia="pt-BR"/>
+          <w14:ligatures w14:val="none"/>
+        </w:rPr>
+        <w:t>senha</w:t>
+      </w:r>
+      <w:proofErr w:type="spellEnd"/>
+      <w:r>
+        <w:rPr>
+          <w:rFonts w:ascii="Consolas" w:eastAsia="Times New Roman" w:hAnsi="Consolas" w:cs="Times New Roman"/>
+          <w:color w:val="D4D4D4"/>
+          <w:kern w:val="0"/>
+          <w:sz w:val="21"/>
+          <w:szCs w:val="21"/>
+          <w:lang w:eastAsia="pt-BR"/>
+          <w14:ligatures w14:val="none"/>
+        </w:rPr>
+        <w:t>);</w:t>
+      </w:r>
+    </w:p>
+    <w:p>
+      <w:pPr>
+        <w:shd w:val="clear" w:color="auto" w:fill="1E1E1E"/>
+        <w:spacing w:after="0" w:line="285" w:lineRule="atLeast"/>
+        <w:rPr>
+          <w:rFonts w:ascii="Consolas" w:eastAsia="Times New Roman" w:hAnsi="Consolas" w:cs="Times New Roman"/>
+          <w:color w:val="D4D4D4"/>
+          <w:kern w:val="0"/>
+          <w:sz w:val="21"/>
+          <w:szCs w:val="21"/>
+          <w:lang w:eastAsia="pt-BR"/>
+          <w14:ligatures w14:val="none"/>
+        </w:rPr>
+      </w:pPr>
+      <w:r>
+        <w:rPr>
+          <w:rFonts w:ascii="Consolas" w:eastAsia="Times New Roman" w:hAnsi="Consolas" w:cs="Times New Roman"/>
+          <w:color w:val="D4D4D4"/>
+          <w:kern w:val="0"/>
+          <w:sz w:val="21"/>
+          <w:szCs w:val="21"/>
+          <w:lang w:eastAsia="pt-BR"/>
+          <w14:ligatures w14:val="none"/>
+        </w:rPr>
+        <w:t xml:space="preserve">            </w:t>
+      </w:r>
+      <w:proofErr w:type="spellStart"/>
+      <w:r>
+        <w:rPr>
+          <w:rFonts w:ascii="Consolas" w:eastAsia="Times New Roman" w:hAnsi="Consolas" w:cs="Times New Roman"/>
+          <w:color w:val="C586C0"/>
+          <w:kern w:val="0"/>
+          <w:sz w:val="21"/>
+          <w:szCs w:val="21"/>
+          <w:lang w:eastAsia="pt-BR"/>
+          <w14:ligatures w14:val="none"/>
+        </w:rPr>
+        <w:t>if</w:t>
+      </w:r>
+      <w:proofErr w:type="spellEnd"/>
+      <w:r>
+        <w:rPr>
+          <w:rFonts w:ascii="Consolas" w:eastAsia="Times New Roman" w:hAnsi="Consolas" w:cs="Times New Roman"/>
+          <w:color w:val="D4D4D4"/>
+          <w:kern w:val="0"/>
+          <w:sz w:val="21"/>
+          <w:szCs w:val="21"/>
+          <w:lang w:eastAsia="pt-BR"/>
+          <w14:ligatures w14:val="none"/>
+        </w:rPr>
+        <w:t xml:space="preserve"> </w:t>
+      </w:r>
+      <w:proofErr w:type="gramStart"/>
+      <w:r>
+        <w:rPr>
+          <w:rFonts w:ascii="Consolas" w:eastAsia="Times New Roman" w:hAnsi="Consolas" w:cs="Times New Roman"/>
+          <w:color w:val="D4D4D4"/>
+          <w:kern w:val="0"/>
+          <w:sz w:val="21"/>
+          <w:szCs w:val="21"/>
+          <w:lang w:eastAsia="pt-BR"/>
+          <w14:ligatures w14:val="none"/>
+        </w:rPr>
+        <w:t>(!</w:t>
+      </w:r>
+      <w:proofErr w:type="spellStart"/>
+      <w:r>
+        <w:rPr>
+          <w:rFonts w:ascii="Consolas" w:eastAsia="Times New Roman" w:hAnsi="Consolas" w:cs="Times New Roman"/>
+          <w:color w:val="4FC1FF"/>
+          <w:kern w:val="0"/>
+          <w:sz w:val="21"/>
+          <w:szCs w:val="21"/>
+          <w:lang w:eastAsia="pt-BR"/>
+          <w14:ligatures w14:val="none"/>
+        </w:rPr>
+        <w:t>isMatch</w:t>
+      </w:r>
+      <w:proofErr w:type="spellEnd"/>
+      <w:proofErr w:type="gramEnd"/>
+      <w:r>
+        <w:rPr>
+          <w:rFonts w:ascii="Consolas" w:eastAsia="Times New Roman" w:hAnsi="Consolas" w:cs="Times New Roman"/>
+          <w:color w:val="D4D4D4"/>
+          <w:kern w:val="0"/>
+          <w:sz w:val="21"/>
+          <w:szCs w:val="21"/>
+          <w:lang w:eastAsia="pt-BR"/>
+          <w14:ligatures w14:val="none"/>
+        </w:rPr>
+        <w:t>) {</w:t>
+      </w:r>
+    </w:p>
+    <w:p>
+      <w:pPr>
+        <w:shd w:val="clear" w:color="auto" w:fill="1E1E1E"/>
+        <w:spacing w:after="0" w:line="285" w:lineRule="atLeast"/>
+        <w:rPr>
+          <w:rFonts w:ascii="Consolas" w:eastAsia="Times New Roman" w:hAnsi="Consolas" w:cs="Times New Roman"/>
+          <w:color w:val="D4D4D4"/>
+          <w:kern w:val="0"/>
+          <w:sz w:val="21"/>
+          <w:szCs w:val="21"/>
+          <w:lang w:eastAsia="pt-BR"/>
+          <w14:ligatures w14:val="none"/>
+        </w:rPr>
+      </w:pPr>
+      <w:r>
+        <w:rPr>
+          <w:rFonts w:ascii="Consolas" w:eastAsia="Times New Roman" w:hAnsi="Consolas" w:cs="Times New Roman"/>
+          <w:color w:val="D4D4D4"/>
+          <w:kern w:val="0"/>
+          <w:sz w:val="21"/>
+          <w:szCs w:val="21"/>
+          <w:lang w:eastAsia="pt-BR"/>
+          <w14:ligatures w14:val="none"/>
+        </w:rPr>
+        <w:t xml:space="preserve">                </w:t>
+      </w:r>
+      <w:proofErr w:type="spellStart"/>
+      <w:r>
+        <w:rPr>
+          <w:rFonts w:ascii="Consolas" w:eastAsia="Times New Roman" w:hAnsi="Consolas" w:cs="Times New Roman"/>
+          <w:color w:val="C586C0"/>
+          <w:kern w:val="0"/>
+          <w:sz w:val="21"/>
+          <w:szCs w:val="21"/>
+          <w:lang w:eastAsia="pt-BR"/>
+          <w14:ligatures w14:val="none"/>
+        </w:rPr>
+        <w:t>return</w:t>
+      </w:r>
+      <w:proofErr w:type="spellEnd"/>
+      <w:r>
+        <w:rPr>
+          <w:rFonts w:ascii="Consolas" w:eastAsia="Times New Roman" w:hAnsi="Consolas" w:cs="Times New Roman"/>
+          <w:color w:val="D4D4D4"/>
+          <w:kern w:val="0"/>
+          <w:sz w:val="21"/>
+          <w:szCs w:val="21"/>
+          <w:lang w:eastAsia="pt-BR"/>
+          <w14:ligatures w14:val="none"/>
+        </w:rPr>
+        <w:t xml:space="preserve"> </w:t>
+      </w:r>
+      <w:proofErr w:type="spellStart"/>
+      <w:proofErr w:type="gramStart"/>
+      <w:r>
+        <w:rPr>
+          <w:rFonts w:ascii="Consolas" w:eastAsia="Times New Roman" w:hAnsi="Consolas" w:cs="Times New Roman"/>
+          <w:color w:val="9CDCFE"/>
+          <w:kern w:val="0"/>
+          <w:sz w:val="21"/>
+          <w:szCs w:val="21"/>
+          <w:lang w:eastAsia="pt-BR"/>
+          <w14:ligatures w14:val="none"/>
+        </w:rPr>
+        <w:t>res</w:t>
+      </w:r>
+      <w:r>
+        <w:rPr>
+          <w:rFonts w:ascii="Consolas" w:eastAsia="Times New Roman" w:hAnsi="Consolas" w:cs="Times New Roman"/>
+          <w:color w:val="D4D4D4"/>
+          <w:kern w:val="0"/>
+          <w:sz w:val="21"/>
+          <w:szCs w:val="21"/>
+          <w:lang w:eastAsia="pt-BR"/>
+          <w14:ligatures w14:val="none"/>
+        </w:rPr>
+        <w:t>.</w:t>
+      </w:r>
+      <w:r>
+        <w:rPr>
+          <w:rFonts w:ascii="Consolas" w:eastAsia="Times New Roman" w:hAnsi="Consolas" w:cs="Times New Roman"/>
+          <w:color w:val="DCDCAA"/>
+          <w:kern w:val="0"/>
+          <w:sz w:val="21"/>
+          <w:szCs w:val="21"/>
+          <w:lang w:eastAsia="pt-BR"/>
+          <w14:ligatures w14:val="none"/>
+        </w:rPr>
+        <w:t>status</w:t>
+      </w:r>
+      <w:proofErr w:type="spellEnd"/>
+      <w:proofErr w:type="gramEnd"/>
+      <w:r>
+        <w:rPr>
+          <w:rFonts w:ascii="Consolas" w:eastAsia="Times New Roman" w:hAnsi="Consolas" w:cs="Times New Roman"/>
+          <w:color w:val="D4D4D4"/>
+          <w:kern w:val="0"/>
+          <w:sz w:val="21"/>
+          <w:szCs w:val="21"/>
+          <w:lang w:eastAsia="pt-BR"/>
+          <w14:ligatures w14:val="none"/>
+        </w:rPr>
+        <w:t>(</w:t>
+      </w:r>
+      <w:r>
+        <w:rPr>
+          <w:rFonts w:ascii="Consolas" w:eastAsia="Times New Roman" w:hAnsi="Consolas" w:cs="Times New Roman"/>
+          <w:color w:val="B5CEA8"/>
+          <w:kern w:val="0"/>
+          <w:sz w:val="21"/>
+          <w:szCs w:val="21"/>
+          <w:lang w:eastAsia="pt-BR"/>
+          <w14:ligatures w14:val="none"/>
+        </w:rPr>
+        <w:t>400</w:t>
+      </w:r>
+      <w:r>
+        <w:rPr>
+          <w:rFonts w:ascii="Consolas" w:eastAsia="Times New Roman" w:hAnsi="Consolas" w:cs="Times New Roman"/>
+          <w:color w:val="D4D4D4"/>
+          <w:kern w:val="0"/>
+          <w:sz w:val="21"/>
+          <w:szCs w:val="21"/>
+          <w:lang w:eastAsia="pt-BR"/>
+          <w14:ligatures w14:val="none"/>
+        </w:rPr>
+        <w:t>).</w:t>
+      </w:r>
+      <w:proofErr w:type="spellStart"/>
+      <w:r>
+        <w:rPr>
+          <w:rFonts w:ascii="Consolas" w:eastAsia="Times New Roman" w:hAnsi="Consolas" w:cs="Times New Roman"/>
+          <w:color w:val="DCDCAA"/>
+          <w:kern w:val="0"/>
+          <w:sz w:val="21"/>
+          <w:szCs w:val="21"/>
+          <w:lang w:eastAsia="pt-BR"/>
+          <w14:ligatures w14:val="none"/>
+        </w:rPr>
+        <w:t>json</w:t>
+      </w:r>
+      <w:proofErr w:type="spellEnd"/>
+      <w:r>
+        <w:rPr>
+          <w:rFonts w:ascii="Consolas" w:eastAsia="Times New Roman" w:hAnsi="Consolas" w:cs="Times New Roman"/>
+          <w:color w:val="D4D4D4"/>
+          <w:kern w:val="0"/>
+          <w:sz w:val="21"/>
+          <w:szCs w:val="21"/>
+          <w:lang w:eastAsia="pt-BR"/>
+          <w14:ligatures w14:val="none"/>
+        </w:rPr>
+        <w:t xml:space="preserve">({ </w:t>
+      </w:r>
+      <w:proofErr w:type="spellStart"/>
+      <w:r>
+        <w:rPr>
+          <w:rFonts w:ascii="Consolas" w:eastAsia="Times New Roman" w:hAnsi="Consolas" w:cs="Times New Roman"/>
+          <w:color w:val="9CDCFE"/>
+          <w:kern w:val="0"/>
+          <w:sz w:val="21"/>
+          <w:szCs w:val="21"/>
+          <w:lang w:eastAsia="pt-BR"/>
+          <w14:ligatures w14:val="none"/>
+        </w:rPr>
+        <w:t>error</w:t>
+      </w:r>
+      <w:proofErr w:type="spellEnd"/>
+      <w:r>
+        <w:rPr>
+          <w:rFonts w:ascii="Consolas" w:eastAsia="Times New Roman" w:hAnsi="Consolas" w:cs="Times New Roman"/>
+          <w:color w:val="9CDCFE"/>
+          <w:kern w:val="0"/>
+          <w:sz w:val="21"/>
+          <w:szCs w:val="21"/>
+          <w:lang w:eastAsia="pt-BR"/>
+          <w14:ligatures w14:val="none"/>
+        </w:rPr>
+        <w:t>:</w:t>
+      </w:r>
+      <w:r>
+        <w:rPr>
+          <w:rFonts w:ascii="Consolas" w:eastAsia="Times New Roman" w:hAnsi="Consolas" w:cs="Times New Roman"/>
+          <w:color w:val="D4D4D4"/>
+          <w:kern w:val="0"/>
+          <w:sz w:val="21"/>
+          <w:szCs w:val="21"/>
+          <w:lang w:eastAsia="pt-BR"/>
+          <w14:ligatures w14:val="none"/>
+        </w:rPr>
+        <w:t xml:space="preserve"> </w:t>
+      </w:r>
+      <w:r>
+        <w:rPr>
+          <w:rFonts w:ascii="Consolas" w:eastAsia="Times New Roman" w:hAnsi="Consolas" w:cs="Times New Roman"/>
+          <w:color w:val="CE9178"/>
+          <w:kern w:val="0"/>
+          <w:sz w:val="21"/>
+          <w:szCs w:val="21"/>
+          <w:lang w:eastAsia="pt-BR"/>
+          <w14:ligatures w14:val="none"/>
+        </w:rPr>
+        <w:t>'Credenciais inválidas'</w:t>
+      </w:r>
+      <w:r>
+        <w:rPr>
+          <w:rFonts w:ascii="Consolas" w:eastAsia="Times New Roman" w:hAnsi="Consolas" w:cs="Times New Roman"/>
+          <w:color w:val="D4D4D4"/>
+          <w:kern w:val="0"/>
+          <w:sz w:val="21"/>
+          <w:szCs w:val="21"/>
+          <w:lang w:eastAsia="pt-BR"/>
+          <w14:ligatures w14:val="none"/>
+        </w:rPr>
+        <w:t>});</w:t>
+      </w:r>
+    </w:p>
+    <w:p>
+      <w:pPr>
+        <w:shd w:val="clear" w:color="auto" w:fill="1E1E1E"/>
+        <w:spacing w:after="0" w:line="285" w:lineRule="atLeast"/>
+        <w:rPr>
+          <w:rFonts w:ascii="Consolas" w:eastAsia="Times New Roman" w:hAnsi="Consolas" w:cs="Times New Roman"/>
+          <w:color w:val="D4D4D4"/>
+          <w:kern w:val="0"/>
+          <w:sz w:val="21"/>
+          <w:szCs w:val="21"/>
+          <w:lang w:eastAsia="pt-BR"/>
+          <w14:ligatures w14:val="none"/>
+        </w:rPr>
+      </w:pPr>
+      <w:r>
+        <w:rPr>
+          <w:rFonts w:ascii="Consolas" w:eastAsia="Times New Roman" w:hAnsi="Consolas" w:cs="Times New Roman"/>
+          <w:color w:val="D4D4D4"/>
+          <w:kern w:val="0"/>
+          <w:sz w:val="21"/>
+          <w:szCs w:val="21"/>
+          <w:lang w:eastAsia="pt-BR"/>
+          <w14:ligatures w14:val="none"/>
+        </w:rPr>
+        <w:t>            }</w:t>
+      </w:r>
+    </w:p>
+    <w:p>
+      <w:pPr>
+        <w:shd w:val="clear" w:color="auto" w:fill="1E1E1E"/>
+        <w:spacing w:after="0" w:line="285" w:lineRule="atLeast"/>
+        <w:rPr>
+          <w:rFonts w:ascii="Consolas" w:eastAsia="Times New Roman" w:hAnsi="Consolas" w:cs="Times New Roman"/>
+          <w:color w:val="D4D4D4"/>
+          <w:kern w:val="0"/>
+          <w:sz w:val="21"/>
+          <w:szCs w:val="21"/>
+          <w:lang w:eastAsia="pt-BR"/>
+          <w14:ligatures w14:val="none"/>
+        </w:rPr>
+      </w:pPr>
+    </w:p>
+    <w:p>
+      <w:pPr>
+        <w:shd w:val="clear" w:color="auto" w:fill="1E1E1E"/>
+        <w:spacing w:after="0" w:line="285" w:lineRule="atLeast"/>
+        <w:rPr>
+          <w:rFonts w:ascii="Consolas" w:eastAsia="Times New Roman" w:hAnsi="Consolas" w:cs="Times New Roman"/>
+          <w:color w:val="D4D4D4"/>
+          <w:kern w:val="0"/>
+          <w:sz w:val="21"/>
+          <w:szCs w:val="21"/>
+          <w:lang w:eastAsia="pt-BR"/>
+          <w14:ligatures w14:val="none"/>
+        </w:rPr>
+      </w:pPr>
+      <w:r>
+        <w:rPr>
+          <w:rFonts w:ascii="Consolas" w:eastAsia="Times New Roman" w:hAnsi="Consolas" w:cs="Times New Roman"/>
+          <w:color w:val="D4D4D4"/>
+          <w:kern w:val="0"/>
+          <w:sz w:val="21"/>
+          <w:szCs w:val="21"/>
+          <w:lang w:eastAsia="pt-BR"/>
+          <w14:ligatures w14:val="none"/>
+        </w:rPr>
+        <w:t xml:space="preserve">            </w:t>
+      </w:r>
+      <w:proofErr w:type="spellStart"/>
+      <w:proofErr w:type="gramStart"/>
+      <w:r>
+        <w:rPr>
+          <w:rFonts w:ascii="Consolas" w:eastAsia="Times New Roman" w:hAnsi="Consolas" w:cs="Times New Roman"/>
+          <w:color w:val="DCDCAA"/>
+          <w:kern w:val="0"/>
+          <w:sz w:val="21"/>
+          <w:szCs w:val="21"/>
+          <w:lang w:eastAsia="pt-BR"/>
+          <w14:ligatures w14:val="none"/>
+        </w:rPr>
+        <w:t>generateTokenAndSetCookie</w:t>
+      </w:r>
+      <w:proofErr w:type="spellEnd"/>
+      <w:r>
+        <w:rPr>
+          <w:rFonts w:ascii="Consolas" w:eastAsia="Times New Roman" w:hAnsi="Consolas" w:cs="Times New Roman"/>
+          <w:color w:val="D4D4D4"/>
+          <w:kern w:val="0"/>
+          <w:sz w:val="21"/>
+          <w:szCs w:val="21"/>
+          <w:lang w:eastAsia="pt-BR"/>
+          <w14:ligatures w14:val="none"/>
+        </w:rPr>
+        <w:t>(</w:t>
+      </w:r>
+      <w:proofErr w:type="gramEnd"/>
+      <w:r>
+        <w:rPr>
+          <w:rFonts w:ascii="Consolas" w:eastAsia="Times New Roman" w:hAnsi="Consolas" w:cs="Times New Roman"/>
+          <w:color w:val="9CDCFE"/>
+          <w:kern w:val="0"/>
+          <w:sz w:val="21"/>
+          <w:szCs w:val="21"/>
+          <w:lang w:eastAsia="pt-BR"/>
+          <w14:ligatures w14:val="none"/>
+        </w:rPr>
+        <w:t>user</w:t>
+      </w:r>
+      <w:r>
+        <w:rPr>
+          <w:rFonts w:ascii="Consolas" w:eastAsia="Times New Roman" w:hAnsi="Consolas" w:cs="Times New Roman"/>
+          <w:color w:val="D4D4D4"/>
+          <w:kern w:val="0"/>
+          <w:sz w:val="21"/>
+          <w:szCs w:val="21"/>
+          <w:lang w:eastAsia="pt-BR"/>
+          <w14:ligatures w14:val="none"/>
+        </w:rPr>
+        <w:t>.</w:t>
+      </w:r>
+      <w:r>
+        <w:rPr>
+          <w:rFonts w:ascii="Consolas" w:eastAsia="Times New Roman" w:hAnsi="Consolas" w:cs="Times New Roman"/>
+          <w:color w:val="9CDCFE"/>
+          <w:kern w:val="0"/>
+          <w:sz w:val="21"/>
+          <w:szCs w:val="21"/>
+          <w:lang w:eastAsia="pt-BR"/>
+          <w14:ligatures w14:val="none"/>
+        </w:rPr>
+        <w:t>id</w:t>
+      </w:r>
+      <w:r>
+        <w:rPr>
+          <w:rFonts w:ascii="Consolas" w:eastAsia="Times New Roman" w:hAnsi="Consolas" w:cs="Times New Roman"/>
+          <w:color w:val="D4D4D4"/>
+          <w:kern w:val="0"/>
+          <w:sz w:val="21"/>
+          <w:szCs w:val="21"/>
+          <w:lang w:eastAsia="pt-BR"/>
+          <w14:ligatures w14:val="none"/>
+        </w:rPr>
+        <w:t xml:space="preserve">, </w:t>
+      </w:r>
+      <w:r>
+        <w:rPr>
+          <w:rFonts w:ascii="Consolas" w:eastAsia="Times New Roman" w:hAnsi="Consolas" w:cs="Times New Roman"/>
+          <w:color w:val="9CDCFE"/>
+          <w:kern w:val="0"/>
+          <w:sz w:val="21"/>
+          <w:szCs w:val="21"/>
+          <w:lang w:eastAsia="pt-BR"/>
+          <w14:ligatures w14:val="none"/>
+        </w:rPr>
+        <w:t>res</w:t>
+      </w:r>
+      <w:r>
+        <w:rPr>
+          <w:rFonts w:ascii="Consolas" w:eastAsia="Times New Roman" w:hAnsi="Consolas" w:cs="Times New Roman"/>
+          <w:color w:val="D4D4D4"/>
+          <w:kern w:val="0"/>
+          <w:sz w:val="21"/>
+          <w:szCs w:val="21"/>
+          <w:lang w:eastAsia="pt-BR"/>
+          <w14:ligatures w14:val="none"/>
+        </w:rPr>
+        <w:t>);</w:t>
+      </w:r>
+    </w:p>
+    <w:p>
+      <w:pPr>
+        <w:shd w:val="clear" w:color="auto" w:fill="1E1E1E"/>
+        <w:spacing w:after="0" w:line="285" w:lineRule="atLeast"/>
+        <w:rPr>
+          <w:rFonts w:ascii="Consolas" w:eastAsia="Times New Roman" w:hAnsi="Consolas" w:cs="Times New Roman"/>
+          <w:color w:val="D4D4D4"/>
+          <w:kern w:val="0"/>
+          <w:sz w:val="21"/>
+          <w:szCs w:val="21"/>
+          <w:lang w:eastAsia="pt-BR"/>
+          <w14:ligatures w14:val="none"/>
+        </w:rPr>
+      </w:pPr>
+    </w:p>
+    <w:p>
+      <w:pPr>
+        <w:shd w:val="clear" w:color="auto" w:fill="1E1E1E"/>
+        <w:spacing w:after="0" w:line="285" w:lineRule="atLeast"/>
+        <w:rPr>
+          <w:rFonts w:ascii="Consolas" w:eastAsia="Times New Roman" w:hAnsi="Consolas" w:cs="Times New Roman"/>
+          <w:color w:val="D4D4D4"/>
+          <w:kern w:val="0"/>
+          <w:sz w:val="21"/>
+          <w:szCs w:val="21"/>
+          <w:lang w:eastAsia="pt-BR"/>
+          <w14:ligatures w14:val="none"/>
+        </w:rPr>
+      </w:pPr>
+      <w:r>
+        <w:rPr>
+          <w:rFonts w:ascii="Consolas" w:eastAsia="Times New Roman" w:hAnsi="Consolas" w:cs="Times New Roman"/>
+          <w:color w:val="D4D4D4"/>
+          <w:kern w:val="0"/>
+          <w:sz w:val="21"/>
+          <w:szCs w:val="21"/>
+          <w:lang w:eastAsia="pt-BR"/>
+          <w14:ligatures w14:val="none"/>
+        </w:rPr>
+        <w:t xml:space="preserve">            </w:t>
+      </w:r>
+      <w:proofErr w:type="spellStart"/>
+      <w:proofErr w:type="gramStart"/>
+      <w:r>
+        <w:rPr>
+          <w:rFonts w:ascii="Consolas" w:eastAsia="Times New Roman" w:hAnsi="Consolas" w:cs="Times New Roman"/>
+          <w:color w:val="9CDCFE"/>
+          <w:kern w:val="0"/>
+          <w:sz w:val="21"/>
+          <w:szCs w:val="21"/>
+          <w:lang w:eastAsia="pt-BR"/>
+          <w14:ligatures w14:val="none"/>
+        </w:rPr>
+        <w:t>res</w:t>
+      </w:r>
+      <w:r>
+        <w:rPr>
+          <w:rFonts w:ascii="Consolas" w:eastAsia="Times New Roman" w:hAnsi="Consolas" w:cs="Times New Roman"/>
+          <w:color w:val="D4D4D4"/>
+          <w:kern w:val="0"/>
+          <w:sz w:val="21"/>
+          <w:szCs w:val="21"/>
+          <w:lang w:eastAsia="pt-BR"/>
+          <w14:ligatures w14:val="none"/>
+        </w:rPr>
+        <w:t>.</w:t>
+      </w:r>
+      <w:r>
+        <w:rPr>
+          <w:rFonts w:ascii="Consolas" w:eastAsia="Times New Roman" w:hAnsi="Consolas" w:cs="Times New Roman"/>
+          <w:color w:val="DCDCAA"/>
+          <w:kern w:val="0"/>
+          <w:sz w:val="21"/>
+          <w:szCs w:val="21"/>
+          <w:lang w:eastAsia="pt-BR"/>
+          <w14:ligatures w14:val="none"/>
+        </w:rPr>
+        <w:t>status</w:t>
+      </w:r>
+      <w:proofErr w:type="spellEnd"/>
+      <w:proofErr w:type="gramEnd"/>
+      <w:r>
+        <w:rPr>
+          <w:rFonts w:ascii="Consolas" w:eastAsia="Times New Roman" w:hAnsi="Consolas" w:cs="Times New Roman"/>
+          <w:color w:val="D4D4D4"/>
+          <w:kern w:val="0"/>
+          <w:sz w:val="21"/>
+          <w:szCs w:val="21"/>
+          <w:lang w:eastAsia="pt-BR"/>
+          <w14:ligatures w14:val="none"/>
+        </w:rPr>
+        <w:t>(</w:t>
+      </w:r>
+      <w:r>
+        <w:rPr>
+          <w:rFonts w:ascii="Consolas" w:eastAsia="Times New Roman" w:hAnsi="Consolas" w:cs="Times New Roman"/>
+          <w:color w:val="B5CEA8"/>
+          <w:kern w:val="0"/>
+          <w:sz w:val="21"/>
+          <w:szCs w:val="21"/>
+          <w:lang w:eastAsia="pt-BR"/>
+          <w14:ligatures w14:val="none"/>
+        </w:rPr>
+        <w:t>200</w:t>
+      </w:r>
+      <w:r>
+        <w:rPr>
+          <w:rFonts w:ascii="Consolas" w:eastAsia="Times New Roman" w:hAnsi="Consolas" w:cs="Times New Roman"/>
+          <w:color w:val="D4D4D4"/>
+          <w:kern w:val="0"/>
+          <w:sz w:val="21"/>
+          <w:szCs w:val="21"/>
+          <w:lang w:eastAsia="pt-BR"/>
+          <w14:ligatures w14:val="none"/>
+        </w:rPr>
+        <w:t>).</w:t>
+      </w:r>
+      <w:proofErr w:type="spellStart"/>
+      <w:r>
+        <w:rPr>
+          <w:rFonts w:ascii="Consolas" w:eastAsia="Times New Roman" w:hAnsi="Consolas" w:cs="Times New Roman"/>
+          <w:color w:val="DCDCAA"/>
+          <w:kern w:val="0"/>
+          <w:sz w:val="21"/>
+          <w:szCs w:val="21"/>
+          <w:lang w:eastAsia="pt-BR"/>
+          <w14:ligatures w14:val="none"/>
+        </w:rPr>
+        <w:t>json</w:t>
+      </w:r>
+      <w:proofErr w:type="spellEnd"/>
+      <w:r>
+        <w:rPr>
+          <w:rFonts w:ascii="Consolas" w:eastAsia="Times New Roman" w:hAnsi="Consolas" w:cs="Times New Roman"/>
+          <w:color w:val="D4D4D4"/>
+          <w:kern w:val="0"/>
+          <w:sz w:val="21"/>
+          <w:szCs w:val="21"/>
+          <w:lang w:eastAsia="pt-BR"/>
+          <w14:ligatures w14:val="none"/>
+        </w:rPr>
+        <w:t xml:space="preserve">({ </w:t>
+      </w:r>
+      <w:proofErr w:type="spellStart"/>
+      <w:r>
+        <w:rPr>
+          <w:rFonts w:ascii="Consolas" w:eastAsia="Times New Roman" w:hAnsi="Consolas" w:cs="Times New Roman"/>
+          <w:color w:val="9CDCFE"/>
+          <w:kern w:val="0"/>
+          <w:sz w:val="21"/>
+          <w:szCs w:val="21"/>
+          <w:lang w:eastAsia="pt-BR"/>
+          <w14:ligatures w14:val="none"/>
+        </w:rPr>
+        <w:t>user</w:t>
+      </w:r>
+      <w:proofErr w:type="spellEnd"/>
+      <w:r>
+        <w:rPr>
+          <w:rFonts w:ascii="Consolas" w:eastAsia="Times New Roman" w:hAnsi="Consolas" w:cs="Times New Roman"/>
+          <w:color w:val="D4D4D4"/>
+          <w:kern w:val="0"/>
+          <w:sz w:val="21"/>
+          <w:szCs w:val="21"/>
+          <w:lang w:eastAsia="pt-BR"/>
+          <w14:ligatures w14:val="none"/>
+        </w:rPr>
+        <w:t xml:space="preserve"> });</w:t>
+      </w:r>
+    </w:p>
+    <w:p>
+      <w:pPr>
+        <w:shd w:val="clear" w:color="auto" w:fill="1E1E1E"/>
+        <w:spacing w:after="0" w:line="285" w:lineRule="atLeast"/>
+        <w:rPr>
+          <w:rFonts w:ascii="Consolas" w:eastAsia="Times New Roman" w:hAnsi="Consolas" w:cs="Times New Roman"/>
+          <w:color w:val="D4D4D4"/>
+          <w:kern w:val="0"/>
+          <w:sz w:val="21"/>
+          <w:szCs w:val="21"/>
+          <w:lang w:eastAsia="pt-BR"/>
+          <w14:ligatures w14:val="none"/>
+        </w:rPr>
+      </w:pPr>
+      <w:r>
+        <w:rPr>
+          <w:rFonts w:ascii="Consolas" w:eastAsia="Times New Roman" w:hAnsi="Consolas" w:cs="Times New Roman"/>
+          <w:color w:val="D4D4D4"/>
+          <w:kern w:val="0"/>
+          <w:sz w:val="21"/>
+          <w:szCs w:val="21"/>
+          <w:lang w:eastAsia="pt-BR"/>
+          <w14:ligatures w14:val="none"/>
+        </w:rPr>
+        <w:t>        });</w:t>
+      </w:r>
+    </w:p>
+    <w:p>
+      <w:pPr>
+        <w:shd w:val="clear" w:color="auto" w:fill="1E1E1E"/>
+        <w:spacing w:after="0" w:line="285" w:lineRule="atLeast"/>
+        <w:rPr>
+          <w:rFonts w:ascii="Consolas" w:eastAsia="Times New Roman" w:hAnsi="Consolas" w:cs="Times New Roman"/>
+          <w:color w:val="D4D4D4"/>
+          <w:kern w:val="0"/>
+          <w:sz w:val="21"/>
+          <w:szCs w:val="21"/>
+          <w:lang w:eastAsia="pt-BR"/>
+          <w14:ligatures w14:val="none"/>
+        </w:rPr>
+      </w:pPr>
+      <w:r>
+        <w:rPr>
+          <w:rFonts w:ascii="Consolas" w:eastAsia="Times New Roman" w:hAnsi="Consolas" w:cs="Times New Roman"/>
+          <w:color w:val="D4D4D4"/>
+          <w:kern w:val="0"/>
+          <w:sz w:val="21"/>
+          <w:szCs w:val="21"/>
+          <w:lang w:eastAsia="pt-BR"/>
+          <w14:ligatures w14:val="none"/>
+        </w:rPr>
+        <w:t xml:space="preserve">    } </w:t>
+      </w:r>
+      <w:r>
+        <w:rPr>
+          <w:rFonts w:ascii="Consolas" w:eastAsia="Times New Roman" w:hAnsi="Consolas" w:cs="Times New Roman"/>
+          <w:color w:val="C586C0"/>
+          <w:kern w:val="0"/>
+          <w:sz w:val="21"/>
+          <w:szCs w:val="21"/>
+          <w:lang w:eastAsia="pt-BR"/>
+          <w14:ligatures w14:val="none"/>
+        </w:rPr>
+        <w:t>catch</w:t>
+      </w:r>
+      <w:r>
+        <w:rPr>
+          <w:rFonts w:ascii="Consolas" w:eastAsia="Times New Roman" w:hAnsi="Consolas" w:cs="Times New Roman"/>
+          <w:color w:val="D4D4D4"/>
+          <w:kern w:val="0"/>
+          <w:sz w:val="21"/>
+          <w:szCs w:val="21"/>
+          <w:lang w:eastAsia="pt-BR"/>
+          <w14:ligatures w14:val="none"/>
+        </w:rPr>
+        <w:t xml:space="preserve"> (</w:t>
+      </w:r>
+      <w:proofErr w:type="spellStart"/>
+      <w:r>
+        <w:rPr>
+          <w:rFonts w:ascii="Consolas" w:eastAsia="Times New Roman" w:hAnsi="Consolas" w:cs="Times New Roman"/>
+          <w:color w:val="9CDCFE"/>
+          <w:kern w:val="0"/>
+          <w:sz w:val="21"/>
+          <w:szCs w:val="21"/>
+          <w:lang w:eastAsia="pt-BR"/>
+          <w14:ligatures w14:val="none"/>
+        </w:rPr>
+        <w:t>err</w:t>
+      </w:r>
+      <w:proofErr w:type="spellEnd"/>
+      <w:r>
+        <w:rPr>
+          <w:rFonts w:ascii="Consolas" w:eastAsia="Times New Roman" w:hAnsi="Consolas" w:cs="Times New Roman"/>
+          <w:color w:val="D4D4D4"/>
+          <w:kern w:val="0"/>
+          <w:sz w:val="21"/>
+          <w:szCs w:val="21"/>
+          <w:lang w:eastAsia="pt-BR"/>
+          <w14:ligatures w14:val="none"/>
+        </w:rPr>
+        <w:t>) {</w:t>
+      </w:r>
+    </w:p>
+    <w:p>
+      <w:pPr>
+        <w:shd w:val="clear" w:color="auto" w:fill="1E1E1E"/>
+        <w:spacing w:after="0" w:line="285" w:lineRule="atLeast"/>
+        <w:rPr>
+          <w:rFonts w:ascii="Consolas" w:eastAsia="Times New Roman" w:hAnsi="Consolas" w:cs="Times New Roman"/>
+          <w:color w:val="D4D4D4"/>
+          <w:kern w:val="0"/>
+          <w:sz w:val="21"/>
+          <w:szCs w:val="21"/>
+          <w:lang w:eastAsia="pt-BR"/>
+          <w14:ligatures w14:val="none"/>
+        </w:rPr>
+      </w:pPr>
+      <w:r>
+        <w:rPr>
+          <w:rFonts w:ascii="Consolas" w:eastAsia="Times New Roman" w:hAnsi="Consolas" w:cs="Times New Roman"/>
+          <w:color w:val="D4D4D4"/>
+          <w:kern w:val="0"/>
+          <w:sz w:val="21"/>
+          <w:szCs w:val="21"/>
+          <w:lang w:eastAsia="pt-BR"/>
+          <w14:ligatures w14:val="none"/>
+        </w:rPr>
+        <w:t xml:space="preserve">        </w:t>
+      </w:r>
+      <w:proofErr w:type="spellStart"/>
+      <w:proofErr w:type="gramStart"/>
+      <w:r>
+        <w:rPr>
+          <w:rFonts w:ascii="Consolas" w:eastAsia="Times New Roman" w:hAnsi="Consolas" w:cs="Times New Roman"/>
+          <w:color w:val="9CDCFE"/>
+          <w:kern w:val="0"/>
+          <w:sz w:val="21"/>
+          <w:szCs w:val="21"/>
+          <w:lang w:eastAsia="pt-BR"/>
+          <w14:ligatures w14:val="none"/>
+        </w:rPr>
+        <w:t>console</w:t>
+      </w:r>
+      <w:r>
+        <w:rPr>
+          <w:rFonts w:ascii="Consolas" w:eastAsia="Times New Roman" w:hAnsi="Consolas" w:cs="Times New Roman"/>
+          <w:color w:val="D4D4D4"/>
+          <w:kern w:val="0"/>
+          <w:sz w:val="21"/>
+          <w:szCs w:val="21"/>
+          <w:lang w:eastAsia="pt-BR"/>
+          <w14:ligatures w14:val="none"/>
+        </w:rPr>
+        <w:t>.</w:t>
+      </w:r>
+      <w:r>
+        <w:rPr>
+          <w:rFonts w:ascii="Consolas" w:eastAsia="Times New Roman" w:hAnsi="Consolas" w:cs="Times New Roman"/>
+          <w:color w:val="DCDCAA"/>
+          <w:kern w:val="0"/>
+          <w:sz w:val="21"/>
+          <w:szCs w:val="21"/>
+          <w:lang w:eastAsia="pt-BR"/>
+          <w14:ligatures w14:val="none"/>
+        </w:rPr>
+        <w:t>error</w:t>
+      </w:r>
+      <w:proofErr w:type="spellEnd"/>
+      <w:proofErr w:type="gramEnd"/>
+      <w:r>
+        <w:rPr>
+          <w:rFonts w:ascii="Consolas" w:eastAsia="Times New Roman" w:hAnsi="Consolas" w:cs="Times New Roman"/>
+          <w:color w:val="D4D4D4"/>
+          <w:kern w:val="0"/>
+          <w:sz w:val="21"/>
+          <w:szCs w:val="21"/>
+          <w:lang w:eastAsia="pt-BR"/>
+          <w14:ligatures w14:val="none"/>
+        </w:rPr>
+        <w:t>(</w:t>
+      </w:r>
+      <w:r>
+        <w:rPr>
+          <w:rFonts w:ascii="Consolas" w:eastAsia="Times New Roman" w:hAnsi="Consolas" w:cs="Times New Roman"/>
+          <w:color w:val="CE9178"/>
+          <w:kern w:val="0"/>
+          <w:sz w:val="21"/>
+          <w:szCs w:val="21"/>
+          <w:lang w:eastAsia="pt-BR"/>
+          <w14:ligatures w14:val="none"/>
+        </w:rPr>
+        <w:t xml:space="preserve">'Erro no login do </w:t>
+      </w:r>
+      <w:proofErr w:type="spellStart"/>
+      <w:r>
+        <w:rPr>
+          <w:rFonts w:ascii="Consolas" w:eastAsia="Times New Roman" w:hAnsi="Consolas" w:cs="Times New Roman"/>
+          <w:color w:val="CE9178"/>
+          <w:kern w:val="0"/>
+          <w:sz w:val="21"/>
+          <w:szCs w:val="21"/>
+          <w:lang w:eastAsia="pt-BR"/>
+          <w14:ligatures w14:val="none"/>
+        </w:rPr>
+        <w:t>usuario</w:t>
+      </w:r>
+      <w:proofErr w:type="spellEnd"/>
+      <w:r>
+        <w:rPr>
+          <w:rFonts w:ascii="Consolas" w:eastAsia="Times New Roman" w:hAnsi="Consolas" w:cs="Times New Roman"/>
+          <w:color w:val="CE9178"/>
+          <w:kern w:val="0"/>
+          <w:sz w:val="21"/>
+          <w:szCs w:val="21"/>
+          <w:lang w:eastAsia="pt-BR"/>
+          <w14:ligatures w14:val="none"/>
+        </w:rPr>
+        <w:t>:'</w:t>
+      </w:r>
+      <w:r>
+        <w:rPr>
+          <w:rFonts w:ascii="Consolas" w:eastAsia="Times New Roman" w:hAnsi="Consolas" w:cs="Times New Roman"/>
+          <w:color w:val="D4D4D4"/>
+          <w:kern w:val="0"/>
+          <w:sz w:val="21"/>
+          <w:szCs w:val="21"/>
+          <w:lang w:eastAsia="pt-BR"/>
+          <w14:ligatures w14:val="none"/>
+        </w:rPr>
+        <w:t xml:space="preserve">, </w:t>
+      </w:r>
+      <w:proofErr w:type="spellStart"/>
+      <w:r>
+        <w:rPr>
+          <w:rFonts w:ascii="Consolas" w:eastAsia="Times New Roman" w:hAnsi="Consolas" w:cs="Times New Roman"/>
+          <w:color w:val="9CDCFE"/>
+          <w:kern w:val="0"/>
+          <w:sz w:val="21"/>
+          <w:szCs w:val="21"/>
+          <w:lang w:eastAsia="pt-BR"/>
+          <w14:ligatures w14:val="none"/>
+        </w:rPr>
+        <w:t>err</w:t>
+      </w:r>
+      <w:r>
+        <w:rPr>
+          <w:rFonts w:ascii="Consolas" w:eastAsia="Times New Roman" w:hAnsi="Consolas" w:cs="Times New Roman"/>
+          <w:color w:val="D4D4D4"/>
+          <w:kern w:val="0"/>
+          <w:sz w:val="21"/>
+          <w:szCs w:val="21"/>
+          <w:lang w:eastAsia="pt-BR"/>
+          <w14:ligatures w14:val="none"/>
+        </w:rPr>
+        <w:t>.</w:t>
+      </w:r>
+      <w:r>
+        <w:rPr>
+          <w:rFonts w:ascii="Consolas" w:eastAsia="Times New Roman" w:hAnsi="Consolas" w:cs="Times New Roman"/>
+          <w:color w:val="9CDCFE"/>
+          <w:kern w:val="0"/>
+          <w:sz w:val="21"/>
+          <w:szCs w:val="21"/>
+          <w:lang w:eastAsia="pt-BR"/>
+          <w14:ligatures w14:val="none"/>
+        </w:rPr>
+        <w:t>message</w:t>
+      </w:r>
+      <w:proofErr w:type="spellEnd"/>
+      <w:r>
+        <w:rPr>
+          <w:rFonts w:ascii="Consolas" w:eastAsia="Times New Roman" w:hAnsi="Consolas" w:cs="Times New Roman"/>
+          <w:color w:val="D4D4D4"/>
+          <w:kern w:val="0"/>
+          <w:sz w:val="21"/>
+          <w:szCs w:val="21"/>
+          <w:lang w:eastAsia="pt-BR"/>
+          <w14:ligatures w14:val="none"/>
+        </w:rPr>
+        <w:t>);</w:t>
+      </w:r>
+    </w:p>
+    <w:p>
+      <w:pPr>
+        <w:shd w:val="clear" w:color="auto" w:fill="1E1E1E"/>
+        <w:spacing w:after="0" w:line="285" w:lineRule="atLeast"/>
+        <w:rPr>
+          <w:rFonts w:ascii="Consolas" w:eastAsia="Times New Roman" w:hAnsi="Consolas" w:cs="Times New Roman"/>
+          <w:color w:val="D4D4D4"/>
+          <w:kern w:val="0"/>
+          <w:sz w:val="21"/>
+          <w:szCs w:val="21"/>
+          <w:lang w:eastAsia="pt-BR"/>
+          <w14:ligatures w14:val="none"/>
+        </w:rPr>
+      </w:pPr>
+      <w:r>
+        <w:rPr>
+          <w:rFonts w:ascii="Consolas" w:eastAsia="Times New Roman" w:hAnsi="Consolas" w:cs="Times New Roman"/>
+          <w:color w:val="D4D4D4"/>
+          <w:kern w:val="0"/>
+          <w:sz w:val="21"/>
+          <w:szCs w:val="21"/>
+          <w:lang w:eastAsia="pt-BR"/>
+          <w14:ligatures w14:val="none"/>
+        </w:rPr>
+        <w:t xml:space="preserve">        </w:t>
+      </w:r>
+      <w:proofErr w:type="spellStart"/>
+      <w:proofErr w:type="gramStart"/>
+      <w:r>
+        <w:rPr>
+          <w:rFonts w:ascii="Consolas" w:eastAsia="Times New Roman" w:hAnsi="Consolas" w:cs="Times New Roman"/>
+          <w:color w:val="9CDCFE"/>
+          <w:kern w:val="0"/>
+          <w:sz w:val="21"/>
+          <w:szCs w:val="21"/>
+          <w:lang w:eastAsia="pt-BR"/>
+          <w14:ligatures w14:val="none"/>
+        </w:rPr>
+        <w:t>res</w:t>
+      </w:r>
+      <w:r>
+        <w:rPr>
+          <w:rFonts w:ascii="Consolas" w:eastAsia="Times New Roman" w:hAnsi="Consolas" w:cs="Times New Roman"/>
+          <w:color w:val="D4D4D4"/>
+          <w:kern w:val="0"/>
+          <w:sz w:val="21"/>
+          <w:szCs w:val="21"/>
+          <w:lang w:eastAsia="pt-BR"/>
+          <w14:ligatures w14:val="none"/>
+        </w:rPr>
+        <w:t>.</w:t>
+      </w:r>
+      <w:r>
+        <w:rPr>
+          <w:rFonts w:ascii="Consolas" w:eastAsia="Times New Roman" w:hAnsi="Consolas" w:cs="Times New Roman"/>
+          <w:color w:val="DCDCAA"/>
+          <w:kern w:val="0"/>
+          <w:sz w:val="21"/>
+          <w:szCs w:val="21"/>
+          <w:lang w:eastAsia="pt-BR"/>
+          <w14:ligatures w14:val="none"/>
+        </w:rPr>
+        <w:t>status</w:t>
+      </w:r>
+      <w:proofErr w:type="spellEnd"/>
+      <w:proofErr w:type="gramEnd"/>
+      <w:r>
+        <w:rPr>
+          <w:rFonts w:ascii="Consolas" w:eastAsia="Times New Roman" w:hAnsi="Consolas" w:cs="Times New Roman"/>
+          <w:color w:val="D4D4D4"/>
+          <w:kern w:val="0"/>
+          <w:sz w:val="21"/>
+          <w:szCs w:val="21"/>
+          <w:lang w:eastAsia="pt-BR"/>
+          <w14:ligatures w14:val="none"/>
+        </w:rPr>
+        <w:t>(</w:t>
+      </w:r>
+      <w:r>
+        <w:rPr>
+          <w:rFonts w:ascii="Consolas" w:eastAsia="Times New Roman" w:hAnsi="Consolas" w:cs="Times New Roman"/>
+          <w:color w:val="B5CEA8"/>
+          <w:kern w:val="0"/>
+          <w:sz w:val="21"/>
+          <w:szCs w:val="21"/>
+          <w:lang w:eastAsia="pt-BR"/>
+          <w14:ligatures w14:val="none"/>
+        </w:rPr>
+        <w:t>500</w:t>
+      </w:r>
+      <w:r>
+        <w:rPr>
+          <w:rFonts w:ascii="Consolas" w:eastAsia="Times New Roman" w:hAnsi="Consolas" w:cs="Times New Roman"/>
+          <w:color w:val="D4D4D4"/>
+          <w:kern w:val="0"/>
+          <w:sz w:val="21"/>
+          <w:szCs w:val="21"/>
+          <w:lang w:eastAsia="pt-BR"/>
+          <w14:ligatures w14:val="none"/>
+        </w:rPr>
+        <w:t>).</w:t>
+      </w:r>
+      <w:proofErr w:type="spellStart"/>
+      <w:r>
+        <w:rPr>
+          <w:rFonts w:ascii="Consolas" w:eastAsia="Times New Roman" w:hAnsi="Consolas" w:cs="Times New Roman"/>
+          <w:color w:val="DCDCAA"/>
+          <w:kern w:val="0"/>
+          <w:sz w:val="21"/>
+          <w:szCs w:val="21"/>
+          <w:lang w:eastAsia="pt-BR"/>
+          <w14:ligatures w14:val="none"/>
+        </w:rPr>
+        <w:t>json</w:t>
+      </w:r>
+      <w:proofErr w:type="spellEnd"/>
+      <w:r>
+        <w:rPr>
+          <w:rFonts w:ascii="Consolas" w:eastAsia="Times New Roman" w:hAnsi="Consolas" w:cs="Times New Roman"/>
+          <w:color w:val="D4D4D4"/>
+          <w:kern w:val="0"/>
+          <w:sz w:val="21"/>
+          <w:szCs w:val="21"/>
+          <w:lang w:eastAsia="pt-BR"/>
+          <w14:ligatures w14:val="none"/>
+        </w:rPr>
+        <w:t xml:space="preserve">({ </w:t>
+      </w:r>
+      <w:proofErr w:type="spellStart"/>
+      <w:r>
+        <w:rPr>
+          <w:rFonts w:ascii="Consolas" w:eastAsia="Times New Roman" w:hAnsi="Consolas" w:cs="Times New Roman"/>
+          <w:color w:val="9CDCFE"/>
+          <w:kern w:val="0"/>
+          <w:sz w:val="21"/>
+          <w:szCs w:val="21"/>
+          <w:lang w:eastAsia="pt-BR"/>
+          <w14:ligatures w14:val="none"/>
+        </w:rPr>
+        <w:t>message</w:t>
+      </w:r>
+      <w:proofErr w:type="spellEnd"/>
+      <w:r>
+        <w:rPr>
+          <w:rFonts w:ascii="Consolas" w:eastAsia="Times New Roman" w:hAnsi="Consolas" w:cs="Times New Roman"/>
+          <w:color w:val="9CDCFE"/>
+          <w:kern w:val="0"/>
+          <w:sz w:val="21"/>
+          <w:szCs w:val="21"/>
+          <w:lang w:eastAsia="pt-BR"/>
+          <w14:ligatures w14:val="none"/>
+        </w:rPr>
+        <w:t>:</w:t>
+      </w:r>
+      <w:r>
+        <w:rPr>
+          <w:rFonts w:ascii="Consolas" w:eastAsia="Times New Roman" w:hAnsi="Consolas" w:cs="Times New Roman"/>
+          <w:color w:val="D4D4D4"/>
+          <w:kern w:val="0"/>
+          <w:sz w:val="21"/>
+          <w:szCs w:val="21"/>
+          <w:lang w:eastAsia="pt-BR"/>
+          <w14:ligatures w14:val="none"/>
+        </w:rPr>
+        <w:t xml:space="preserve"> </w:t>
+      </w:r>
+      <w:r>
+        <w:rPr>
+          <w:rFonts w:ascii="Consolas" w:eastAsia="Times New Roman" w:hAnsi="Consolas" w:cs="Times New Roman"/>
+          <w:color w:val="CE9178"/>
+          <w:kern w:val="0"/>
+          <w:sz w:val="21"/>
+          <w:szCs w:val="21"/>
+          <w:lang w:eastAsia="pt-BR"/>
+          <w14:ligatures w14:val="none"/>
+        </w:rPr>
+        <w:t>'Erro no login do usuário'</w:t>
+      </w:r>
+      <w:r>
+        <w:rPr>
+          <w:rFonts w:ascii="Consolas" w:eastAsia="Times New Roman" w:hAnsi="Consolas" w:cs="Times New Roman"/>
+          <w:color w:val="D4D4D4"/>
+          <w:kern w:val="0"/>
+          <w:sz w:val="21"/>
+          <w:szCs w:val="21"/>
+          <w:lang w:eastAsia="pt-BR"/>
+          <w14:ligatures w14:val="none"/>
+        </w:rPr>
+        <w:t>});</w:t>
+      </w:r>
+    </w:p>
+    <w:p>
+      <w:pPr>
+        <w:shd w:val="clear" w:color="auto" w:fill="1E1E1E"/>
+        <w:spacing w:after="0" w:line="285" w:lineRule="atLeast"/>
+        <w:rPr>
+          <w:rFonts w:ascii="Consolas" w:eastAsia="Times New Roman" w:hAnsi="Consolas" w:cs="Times New Roman"/>
+          <w:color w:val="D4D4D4"/>
+          <w:kern w:val="0"/>
+          <w:sz w:val="21"/>
+          <w:szCs w:val="21"/>
+          <w:lang w:eastAsia="pt-BR"/>
+          <w14:ligatures w14:val="none"/>
+        </w:rPr>
+      </w:pPr>
+      <w:r>
+        <w:rPr>
+          <w:rFonts w:ascii="Consolas" w:eastAsia="Times New Roman" w:hAnsi="Consolas" w:cs="Times New Roman"/>
+          <w:color w:val="D4D4D4"/>
+          <w:kern w:val="0"/>
+          <w:sz w:val="21"/>
+          <w:szCs w:val="21"/>
+          <w:lang w:eastAsia="pt-BR"/>
+          <w14:ligatures w14:val="none"/>
+        </w:rPr>
+        <w:t>    }</w:t>
       </w:r>
     </w:p>
     <w:p/>
+    <w:p>
+      <w:r>
+        <w:t>Então agora estou fazendo o Login Endpoit</w:t>
+      </w:r>
+    </w:p>
     <w:sectPr>
       <w:pgSz w:w="11906" w:h="16838"/>
       <w:pgMar w:top="1417" w:right="1701" w:bottom="1417" w:left="1701" w:header="708" w:footer="708" w:gutter="0"/>

</xml_diff>